<commit_message>
Version essentielle : annexe des plannings hebdomadaires et contrôle des sources
Co-Authored-By: Claude Sonnet 5.5 <noreply@anthropic.com>
Claude-Session: https://claude.ai/code/session_01N3xc7BzoCjYjKrEFpJv8SX
</commit_message>
<xml_diff>
--- a/05-Plan-Carriere/Plan-carriere-Red-Team-2026-2028-essentiel.docx
+++ b/05-Plan-Carriere/Plan-carriere-Red-Team-2026-2028-essentiel.docx
@@ -640,7 +640,7 @@
         <w:rPr>
           <w:i w:val="0"/>
         </w:rPr>
-        <w:t>Capacité réelle : environ 13 h par semaine en moyenne, soit 550 à 600 h utiles par an (avis). Semaine d'entreprise : 15 h. Semaine d'école : 9 h 30. Le dimanche reste libre dans toutes les phases. Les blocs du lundi au vendredi démarrent à 18 h et ne dépassent jamais 21 h ; le samedi commence à 9 h (hypothèse). À partir de mi-décembre, le mardi est consacré à la BSCP.</w:t>
+        <w:t>Capacité réelle : environ 13 h par semaine en moyenne, soit 550 à 600 h utiles par an (avis). Semaine d'entreprise : 15 h. Semaine d'école : 9 h 30. Le dimanche reste libre dans toutes les phases. Les blocs du lundi au vendredi démarrent à 18 h et ne dépassent jamais 21 h ; le samedi commence à 9 h (hypothèse). À partir de mi-décembre, le mardi est consacré à la BSCP. Le schéma jour par jour avec les créneaux horaires est en annexe A.</w:t>
       </w:r>
     </w:p>
     <w:tbl>
@@ -2784,7 +2784,7 @@
         <w:t xml:space="preserve">Employeurs : </w:t>
       </w:r>
       <w:r>
-        <w:t>cabinets PASSI (Synacktiv, XMCO) et équipes internes de banques et assurances, portées par DORA et les tests de pénétration fondés sur la menace. Les salaires relevés vont de 45 000 à 80 000 € selon l'expérience exigée.</w:t>
+        <w:t>cabinets PASSI (Synacktiv, XMCO) et équipes internes de banques et assurances, portées par DORA et les tests de pénétration fondés sur la menace. Les salaires relevés vont de 45 000 à 80 000 € selon l'expérience exigée (non revérifiés ; l'offre Synacktiv retrouvée affiche un minimum de 44 400 € brut).</w:t>
       </w:r>
     </w:p>
     <w:p>
@@ -3432,7 +3432,7 @@
               <w:rPr>
                 <w:sz w:val="17"/>
               </w:rPr>
-              <w:t>649 $ pour 60 jours</w:t>
+              <w:t>649 $ pour 60 jours (449 $ pour 30 j, 849 $ pour 90 j)</w:t>
             </w:r>
           </w:p>
         </w:tc>
@@ -3449,7 +3449,7 @@
               <w:rPr>
                 <w:sz w:val="17"/>
               </w:rPr>
-              <w:t>Retour d'avril 2026</w:t>
+              <w:t>Confirmé sur la page officielle, non datée</w:t>
             </w:r>
           </w:p>
         </w:tc>
@@ -3654,7 +3654,7 @@
               <w:rPr>
                 <w:sz w:val="17"/>
               </w:rPr>
-              <w:t>99 $</w:t>
+              <w:t>99 $ = prix de l'examen</w:t>
             </w:r>
           </w:p>
         </w:tc>
@@ -3671,7 +3671,7 @@
               <w:rPr>
                 <w:sz w:val="17"/>
               </w:rPr>
-              <w:t>Source tierce</w:t>
+              <w:t>Source tierce ; prix d'une reprise non trouvé</w:t>
             </w:r>
           </w:p>
         </w:tc>
@@ -3719,7 +3719,7 @@
         <w:t xml:space="preserve">Vérifier trois informations que je n'ai pas pu obtenir : </w:t>
       </w:r>
       <w:r>
-        <w:t>les heures, la date d'expiration et le nombre de tentatives d'examen du lab CRTO ; le prix de renouvellement de ton abonnement HackTheBox historique face à HTB PRO ; les prérequis du cours EDR de Maldev Academy. Le calendrier des labs et les décisions D2 et D5 en dépendent.</w:t>
+        <w:t>les heures, la date d'expiration et le nombre de tentatives d'examen du lab CRTO ; le prix de renouvellement de ton abonnement HackTheBox historique face à HTB PRO ; les prérequis du cours EDR de Maldev Academy. Le calendrier des labs et les décisions D2 et D5 en dépendent. Une source tierce d'août 2026 annonce des labs CRTO sans expiration et des reprises d'examen gratuites : à confirmer dans ton espace Zero-Point.</w:t>
       </w:r>
     </w:p>
     <w:p>
@@ -3744,11 +3744,1355 @@
           <w:color w:val="555555"/>
           <w:sz w:val="18"/>
         </w:rPr>
-        <w:t>Informations que tu m'as données le 14 octobre 2026 et que je n'ai pas pu vérifier : abonnement HackTheBox actif jusqu'au 8 octobre 2027 avec accès aux Pro Labs et Mini Pro Labs ; lab CRTO inclus dans ton achat ; cours EDR édité par Maldev Academy ; contrat d'apprentissage de deux ans au ministère sans activité offensive ; pas de mémoire ni de soutenance en M2 ; fin du travail à 16 h 30, retour vers 17 h 15, travail possible jusque vers 21 h. Prix et contenus issus d'extraits de recherche consultés le 14 octobre 2026 (pages des sites inaccessibles) ; sources détaillées dans le plan complet.</w:t>
+        <w:t>Informations que tu m'as données le 14 octobre 2026 et que je n'ai pas pu vérifier : abonnement HackTheBox actif jusqu'au 8 octobre 2027 avec accès aux Pro Labs et Mini Pro Labs ; lab CRTO inclus dans ton achat ; cours EDR édité par Maldev Academy ; contrat d'apprentissage de deux ans au ministère sans activité offensive ; pas de mémoire ni de soutenance en M2 ; fin du travail à 16 h 30, retour vers 17 h 15, travail possible jusque vers 21 h. Contrôle des sources : annexe B.</w:t>
+      </w:r>
+    </w:p>
+    <w:p>
+      <w:pPr>
+        <w:sectPr>
+          <w:footerReference w:type="default" r:id="rId12"/>
+          <w:pgSz w:w="11906" w:h="16838"/>
+          <w:pgMar w:top="1020" w:right="1134" w:bottom="1020" w:left="1134" w:header="720" w:footer="720" w:gutter="0"/>
+          <w:cols w:space="720"/>
+          <w:docGrid w:linePitch="360"/>
+        </w:sectPr>
+      </w:pPr>
+    </w:p>
+    <w:p>
+      <w:pPr>
+        <w:pStyle w:val="Heading1"/>
+      </w:pPr>
+      <w:r>
+        <w:t>Annexe A. Plannings hebdomadaires jour par jour</w:t>
+      </w:r>
+    </w:p>
+    <w:p>
+      <w:r>
+        <w:rPr>
+          <w:i w:val="0"/>
+          <w:sz w:val="19"/>
+        </w:rPr>
+        <w:t>Chaque ligne est un jour, chaque bloc une séance avec son créneau et sa durée ; le total du jour est à droite. Les blocs du lundi au vendredi commencent à 18 h et finissent au plus tard à 20 h 30 ; le samedi commence à 9 h (hypothèse) ; le dimanche reste libre. Créneaux proposés (avis) : tu peux déplacer un bloc d'un jour à l'autre sans changer les totaux. Je n'ai pas tes horaires de fin de cours : les semaines d'école reprennent la même fenêtre, à vérifier.</w:t>
+      </w:r>
+    </w:p>
+    <w:p>
+      <w:pPr>
+        <w:jc w:val="center"/>
+      </w:pPr>
+      <w:r>
+        <w:drawing>
+          <wp:inline xmlns:a="http://schemas.openxmlformats.org/drawingml/2006/main" xmlns:pic="http://schemas.openxmlformats.org/drawingml/2006/picture">
+            <wp:extent cx="7740000" cy="4855091"/>
+            <wp:docPr id="2" name="Picture 2"/>
+            <wp:cNvGraphicFramePr>
+              <a:graphicFrameLocks noChangeAspect="1"/>
+            </wp:cNvGraphicFramePr>
+            <a:graphic>
+              <a:graphicData uri="http://schemas.openxmlformats.org/drawingml/2006/picture">
+                <pic:pic>
+                  <pic:nvPicPr>
+                    <pic:cNvPr id="0" name="planning_entreprise.png"/>
+                    <pic:cNvPicPr/>
+                  </pic:nvPicPr>
+                  <pic:blipFill>
+                    <a:blip r:embed="rId10"/>
+                    <a:stretch>
+                      <a:fillRect/>
+                    </a:stretch>
+                  </pic:blipFill>
+                  <pic:spPr>
+                    <a:xfrm>
+                      <a:off x="0" y="0"/>
+                      <a:ext cx="7740000" cy="4855091"/>
+                    </a:xfrm>
+                    <a:prstGeom prst="rect"/>
+                  </pic:spPr>
+                </pic:pic>
+              </a:graphicData>
+            </a:graphic>
+          </wp:inline>
+        </w:drawing>
+      </w:r>
+    </w:p>
+    <w:p>
+      <w:r>
+        <w:br w:type="page"/>
+      </w:r>
+    </w:p>
+    <w:p>
+      <w:pPr>
+        <w:jc w:val="center"/>
+      </w:pPr>
+      <w:r>
+        <w:drawing>
+          <wp:inline xmlns:a="http://schemas.openxmlformats.org/drawingml/2006/main" xmlns:pic="http://schemas.openxmlformats.org/drawingml/2006/picture">
+            <wp:extent cx="7740000" cy="4855091"/>
+            <wp:docPr id="3" name="Picture 3"/>
+            <wp:cNvGraphicFramePr>
+              <a:graphicFrameLocks noChangeAspect="1"/>
+            </wp:cNvGraphicFramePr>
+            <a:graphic>
+              <a:graphicData uri="http://schemas.openxmlformats.org/drawingml/2006/picture">
+                <pic:pic>
+                  <pic:nvPicPr>
+                    <pic:cNvPr id="0" name="planning_ecole.png"/>
+                    <pic:cNvPicPr/>
+                  </pic:nvPicPr>
+                  <pic:blipFill>
+                    <a:blip r:embed="rId11"/>
+                    <a:stretch>
+                      <a:fillRect/>
+                    </a:stretch>
+                  </pic:blipFill>
+                  <pic:spPr>
+                    <a:xfrm>
+                      <a:off x="0" y="0"/>
+                      <a:ext cx="7740000" cy="4855091"/>
+                    </a:xfrm>
+                    <a:prstGeom prst="rect"/>
+                  </pic:spPr>
+                </pic:pic>
+              </a:graphicData>
+            </a:graphic>
+          </wp:inline>
+        </w:drawing>
+      </w:r>
+    </w:p>
+    <w:p>
+      <w:pPr>
+        <w:sectPr>
+          <w:pgSz w:w="16838" w:h="11906" w:orient="landscape"/>
+          <w:pgMar w:top="850" w:right="1020" w:bottom="850" w:left="1020" w:header="720" w:footer="720" w:gutter="0"/>
+          <w:cols w:space="720"/>
+          <w:docGrid w:linePitch="360"/>
+        </w:sectPr>
+      </w:pPr>
+    </w:p>
+    <w:p>
+      <w:pPr>
+        <w:pStyle w:val="Heading1"/>
+      </w:pPr>
+      <w:r>
+        <w:t>Annexe B. Contrôle des sources (14 octobre 2026)</w:t>
+      </w:r>
+    </w:p>
+    <w:p>
+      <w:r>
+        <w:rPr>
+          <w:i w:val="0"/>
+          <w:sz w:val="19"/>
+        </w:rPr>
+        <w:t>Méthode et limite : la lecture directe des sites est impossible depuis cet environnement (les adresses ne se résolvent pas). Chaque affirmation a donc été recoupée par recherche web, à partir d'extraits de pages officielles ou de sources secondaires. « Confirmé » signifie que l'extrait d'une source citée dit la même chose ; ce n'est pas une lecture de la page complète. Les notes de réalisme, durées et classements sont des avis et ne se vérifient pas. Les corrections issues du contrôle sont déjà appliquées dans cette version essentielle ; le plan complet de 38 pages n'a pas été modifié.</w:t>
+      </w:r>
+    </w:p>
+    <w:tbl>
+      <w:tblPr>
+        <w:tblStyle w:val="TableGrid"/>
+        <w:jc w:val="center"/>
+        <w:tblLayout w:type="fixed"/>
+        <w:tblLook w:firstColumn="1" w:firstRow="1" w:lastColumn="0" w:lastRow="0" w:noHBand="0" w:noVBand="1" w:val="04A0"/>
+        <w:tblLayout w:type="fixed"/>
+        <w:tblW w:w="9639" w:type="dxa"/>
+      </w:tblPr>
+      <w:tblGrid>
+        <w:gridCol w:w="3515"/>
+        <w:gridCol w:w="2041"/>
+        <w:gridCol w:w="4082"/>
+      </w:tblGrid>
+      <w:tr>
+        <w:trPr>
+          <w:tblHeader w:val="true"/>
+        </w:trPr>
+        <w:tc>
+          <w:tcPr>
+            <w:tcW w:type="dxa" w:w="3515"/>
+            <w:shd w:val="clear" w:color="auto" w:fill="1F3A5F"/>
+          </w:tcPr>
+          <w:p>
+            <w:r/>
+            <w:r>
+              <w:rPr>
+                <w:b/>
+                <w:color w:val="FFFFFF"/>
+                <w:sz w:val="16"/>
+              </w:rPr>
+              <w:t>Affirmation du plan</w:t>
+            </w:r>
+          </w:p>
+        </w:tc>
+        <w:tc>
+          <w:tcPr>
+            <w:tcW w:type="dxa" w:w="2041"/>
+            <w:shd w:val="clear" w:color="auto" w:fill="1F3A5F"/>
+          </w:tcPr>
+          <w:p>
+            <w:r/>
+            <w:r>
+              <w:rPr>
+                <w:b/>
+                <w:color w:val="FFFFFF"/>
+                <w:sz w:val="16"/>
+              </w:rPr>
+              <w:t>Résultat</w:t>
+            </w:r>
+          </w:p>
+        </w:tc>
+        <w:tc>
+          <w:tcPr>
+            <w:tcW w:type="dxa" w:w="4082"/>
+            <w:shd w:val="clear" w:color="auto" w:fill="1F3A5F"/>
+          </w:tcPr>
+          <w:p>
+            <w:r/>
+            <w:r>
+              <w:rPr>
+                <w:b/>
+                <w:color w:val="FFFFFF"/>
+                <w:sz w:val="16"/>
+              </w:rPr>
+              <w:t>Écart ou précaution</w:t>
+            </w:r>
+          </w:p>
+        </w:tc>
+      </w:tr>
+      <w:tr>
+        <w:trPr>
+          <w:cantSplit w:val="true"/>
+        </w:trPr>
+        <w:tc>
+          <w:tcPr>
+            <w:tcW w:type="dxa" w:w="3515"/>
+            <w:shd w:val="clear" w:color="auto" w:fill="E3F2E8"/>
+          </w:tcPr>
+          <w:p>
+            <w:pPr>
+              <w:spacing w:after="0"/>
+            </w:pPr>
+            <w:r/>
+            <w:r>
+              <w:rPr>
+                <w:sz w:val="16"/>
+              </w:rPr>
+              <w:t>HTB PRO : 49 $ par mois ou 490 $ par an dès le 30 septembre 2026</w:t>
+            </w:r>
+          </w:p>
+        </w:tc>
+        <w:tc>
+          <w:tcPr>
+            <w:tcW w:type="dxa" w:w="2041"/>
+            <w:shd w:val="clear" w:color="auto" w:fill="E3F2E8"/>
+          </w:tcPr>
+          <w:p>
+            <w:pPr>
+              <w:spacing w:after="0"/>
+            </w:pPr>
+            <w:r/>
+            <w:r>
+              <w:rPr>
+                <w:sz w:val="16"/>
+              </w:rPr>
+              <w:t>Confirmé (blog HackTheBox)</w:t>
+            </w:r>
+          </w:p>
+        </w:tc>
+        <w:tc>
+          <w:tcPr>
+            <w:tcW w:type="dxa" w:w="4082"/>
+            <w:shd w:val="clear" w:color="auto" w:fill="E3F2E8"/>
+          </w:tcPr>
+          <w:p>
+            <w:pPr>
+              <w:spacing w:after="0"/>
+            </w:pPr>
+            <w:r/>
+            <w:r>
+              <w:rPr>
+                <w:sz w:val="16"/>
+              </w:rPr>
+              <w:t>La liste des dix Pro Labs inclus n'a pas été retrouvée.</w:t>
+            </w:r>
+          </w:p>
+        </w:tc>
+      </w:tr>
+      <w:tr>
+        <w:trPr>
+          <w:cantSplit w:val="true"/>
+        </w:trPr>
+        <w:tc>
+          <w:tcPr>
+            <w:tcW w:type="dxa" w:w="3515"/>
+            <w:shd w:val="clear" w:color="auto" w:fill="E3F2E8"/>
+          </w:tcPr>
+          <w:p>
+            <w:pPr>
+              <w:spacing w:after="0"/>
+            </w:pPr>
+            <w:r/>
+            <w:r>
+              <w:rPr>
+                <w:sz w:val="16"/>
+              </w:rPr>
+              <w:t>Rachat de Zero-Point Security par Fortra en avril 2026</w:t>
+            </w:r>
+          </w:p>
+        </w:tc>
+        <w:tc>
+          <w:tcPr>
+            <w:tcW w:type="dxa" w:w="2041"/>
+            <w:shd w:val="clear" w:color="auto" w:fill="E3F2E8"/>
+          </w:tcPr>
+          <w:p>
+            <w:pPr>
+              <w:spacing w:after="0"/>
+            </w:pPr>
+            <w:r/>
+            <w:r>
+              <w:rPr>
+                <w:sz w:val="16"/>
+              </w:rPr>
+              <w:t>Confirmé (Fortra, cabinet Gateley, presse)</w:t>
+            </w:r>
+          </w:p>
+        </w:tc>
+        <w:tc>
+          <w:tcPr>
+            <w:tcW w:type="dxa" w:w="4082"/>
+            <w:shd w:val="clear" w:color="auto" w:fill="E3F2E8"/>
+          </w:tcPr>
+          <w:p>
+            <w:pPr>
+              <w:spacing w:after="0"/>
+            </w:pPr>
+            <w:r/>
+            <w:r>
+              <w:rPr>
+                <w:sz w:val="16"/>
+              </w:rPr>
+              <w:t>Le 2 ou le 3 avril selon la source.</w:t>
+            </w:r>
+          </w:p>
+        </w:tc>
+      </w:tr>
+      <w:tr>
+        <w:trPr>
+          <w:cantSplit w:val="true"/>
+        </w:trPr>
+        <w:tc>
+          <w:tcPr>
+            <w:tcW w:type="dxa" w:w="3515"/>
+            <w:shd w:val="clear" w:color="auto" w:fill="E3F2E8"/>
+          </w:tcPr>
+          <w:p>
+            <w:pPr>
+              <w:spacing w:after="0"/>
+            </w:pPr>
+            <w:r/>
+            <w:r>
+              <w:rPr>
+                <w:sz w:val="16"/>
+              </w:rPr>
+              <w:t>« CRTO II » est le cours Red Team Ops II, qui mène à la CRTL ; 399 £ avec bon d'examen ; lab vendu à part</w:t>
+            </w:r>
+          </w:p>
+        </w:tc>
+        <w:tc>
+          <w:tcPr>
+            <w:tcW w:type="dxa" w:w="2041"/>
+            <w:shd w:val="clear" w:color="auto" w:fill="E3F2E8"/>
+          </w:tcPr>
+          <w:p>
+            <w:pPr>
+              <w:spacing w:after="0"/>
+            </w:pPr>
+            <w:r/>
+            <w:r>
+              <w:rPr>
+                <w:sz w:val="16"/>
+              </w:rPr>
+              <w:t>Confirmé (avis de 2022 et 2023)</w:t>
+            </w:r>
+          </w:p>
+        </w:tc>
+        <w:tc>
+          <w:tcPr>
+            <w:tcW w:type="dxa" w:w="4082"/>
+            <w:shd w:val="clear" w:color="auto" w:fill="E3F2E8"/>
+          </w:tcPr>
+          <w:p>
+            <w:pPr>
+              <w:spacing w:after="0"/>
+            </w:pPr>
+            <w:r/>
+            <w:r>
+              <w:rPr>
+                <w:sz w:val="16"/>
+              </w:rPr>
+              <w:t>Prix actuel du lab non retrouvé : le plan le signale déjà comme incertain.</w:t>
+            </w:r>
+          </w:p>
+        </w:tc>
+      </w:tr>
+      <w:tr>
+        <w:trPr>
+          <w:cantSplit w:val="true"/>
+        </w:trPr>
+        <w:tc>
+          <w:tcPr>
+            <w:tcW w:type="dxa" w:w="3515"/>
+            <w:shd w:val="clear" w:color="auto" w:fill="E3F2E8"/>
+          </w:tcPr>
+          <w:p>
+            <w:pPr>
+              <w:spacing w:after="0"/>
+            </w:pPr>
+            <w:r/>
+            <w:r>
+              <w:rPr>
+                <w:sz w:val="16"/>
+              </w:rPr>
+              <w:t>CRTO réécrit en mai 2025 et noté en partie sur la discrétion</w:t>
+            </w:r>
+          </w:p>
+        </w:tc>
+        <w:tc>
+          <w:tcPr>
+            <w:tcW w:type="dxa" w:w="2041"/>
+            <w:shd w:val="clear" w:color="auto" w:fill="E3F2E8"/>
+          </w:tcPr>
+          <w:p>
+            <w:pPr>
+              <w:spacing w:after="0"/>
+            </w:pPr>
+            <w:r/>
+            <w:r>
+              <w:rPr>
+                <w:sz w:val="16"/>
+              </w:rPr>
+              <w:t>Confirmé (plusieurs retours 2025 et 2026)</w:t>
+            </w:r>
+          </w:p>
+        </w:tc>
+        <w:tc>
+          <w:tcPr>
+            <w:tcW w:type="dxa" w:w="4082"/>
+            <w:shd w:val="clear" w:color="auto" w:fill="E3F2E8"/>
+          </w:tcPr>
+          <w:p>
+            <w:pPr>
+              <w:spacing w:after="0"/>
+            </w:pPr>
+            <w:r/>
+            <w:r>
+              <w:rPr>
+                <w:sz w:val="16"/>
+              </w:rPr>
+              <w:t>Seuil de réussite (85 % ou 70 %) et durée (24 h ou 48 h) divergent selon les sources ; Zero-Point ne publie pas le barème.</w:t>
+            </w:r>
+          </w:p>
+        </w:tc>
+      </w:tr>
+      <w:tr>
+        <w:trPr>
+          <w:cantSplit w:val="true"/>
+        </w:trPr>
+        <w:tc>
+          <w:tcPr>
+            <w:tcW w:type="dxa" w:w="3515"/>
+            <w:shd w:val="clear" w:color="auto" w:fill="FFF4D6"/>
+          </w:tcPr>
+          <w:p>
+            <w:pPr>
+              <w:spacing w:after="0"/>
+            </w:pPr>
+            <w:r/>
+            <w:r>
+              <w:rPr>
+                <w:sz w:val="16"/>
+              </w:rPr>
+              <w:t>Lab CRTO : heures et expiration</w:t>
+            </w:r>
+          </w:p>
+        </w:tc>
+        <w:tc>
+          <w:tcPr>
+            <w:tcW w:type="dxa" w:w="2041"/>
+            <w:shd w:val="clear" w:color="auto" w:fill="FFF4D6"/>
+          </w:tcPr>
+          <w:p>
+            <w:pPr>
+              <w:spacing w:after="0"/>
+            </w:pPr>
+            <w:r/>
+            <w:r>
+              <w:rPr>
+                <w:sz w:val="16"/>
+              </w:rPr>
+              <w:t>Partiel</w:t>
+            </w:r>
+          </w:p>
+        </w:tc>
+        <w:tc>
+          <w:tcPr>
+            <w:tcW w:type="dxa" w:w="4082"/>
+            <w:shd w:val="clear" w:color="auto" w:fill="FFF4D6"/>
+          </w:tcPr>
+          <w:p>
+            <w:pPr>
+              <w:spacing w:after="0"/>
+            </w:pPr>
+            <w:r/>
+            <w:r>
+              <w:rPr>
+                <w:sz w:val="16"/>
+              </w:rPr>
+              <w:t>Une source tierce d'août 2026 dit : labs sans expiration, reprises d'examen gratuites et illimitées. Aucune confirmation officielle : ta vérification reste nécessaire.</w:t>
+            </w:r>
+          </w:p>
+        </w:tc>
+      </w:tr>
+      <w:tr>
+        <w:trPr>
+          <w:cantSplit w:val="true"/>
+        </w:trPr>
+        <w:tc>
+          <w:tcPr>
+            <w:tcW w:type="dxa" w:w="3515"/>
+            <w:shd w:val="clear" w:color="auto" w:fill="E3F2E8"/>
+          </w:tcPr>
+          <w:p>
+            <w:pPr>
+              <w:spacing w:after="0"/>
+            </w:pPr>
+            <w:r/>
+            <w:r>
+              <w:rPr>
+                <w:sz w:val="16"/>
+              </w:rPr>
+              <w:t>BSCP : licence Burp Suite Professional exigée</w:t>
+            </w:r>
+          </w:p>
+        </w:tc>
+        <w:tc>
+          <w:tcPr>
+            <w:tcW w:type="dxa" w:w="2041"/>
+            <w:shd w:val="clear" w:color="auto" w:fill="E3F2E8"/>
+          </w:tcPr>
+          <w:p>
+            <w:pPr>
+              <w:spacing w:after="0"/>
+            </w:pPr>
+            <w:r/>
+            <w:r>
+              <w:rPr>
+                <w:sz w:val="16"/>
+              </w:rPr>
+              <w:t>Confirmé (FAQ PortSwigger)</w:t>
+            </w:r>
+          </w:p>
+        </w:tc>
+        <w:tc>
+          <w:tcPr>
+            <w:tcW w:type="dxa" w:w="4082"/>
+            <w:shd w:val="clear" w:color="auto" w:fill="E3F2E8"/>
+          </w:tcPr>
+          <w:p>
+            <w:pPr>
+              <w:spacing w:after="0"/>
+            </w:pPr>
+            <w:r/>
+            <w:r>
+              <w:rPr>
+                <w:sz w:val="16"/>
+              </w:rPr>
+              <w:t>99 $ est le prix de l'examen (source tierce), pas d'une reprise : prix de reprise non trouvé. Corrigé dans le budget.</w:t>
+            </w:r>
+          </w:p>
+        </w:tc>
+      </w:tr>
+      <w:tr>
+        <w:trPr>
+          <w:cantSplit w:val="true"/>
+        </w:trPr>
+        <w:tc>
+          <w:tcPr>
+            <w:tcW w:type="dxa" w:w="3515"/>
+            <w:shd w:val="clear" w:color="auto" w:fill="E3F2E8"/>
+          </w:tcPr>
+          <w:p>
+            <w:pPr>
+              <w:spacing w:after="0"/>
+            </w:pPr>
+            <w:r/>
+            <w:r>
+              <w:rPr>
+                <w:sz w:val="16"/>
+              </w:rPr>
+              <w:t>OSEP : 1 749 $ pour 90 jours et une tentative ; Learn One 2 749 $ par an</w:t>
+            </w:r>
+          </w:p>
+        </w:tc>
+        <w:tc>
+          <w:tcPr>
+            <w:tcW w:type="dxa" w:w="2041"/>
+            <w:shd w:val="clear" w:color="auto" w:fill="E3F2E8"/>
+          </w:tcPr>
+          <w:p>
+            <w:pPr>
+              <w:spacing w:after="0"/>
+            </w:pPr>
+            <w:r/>
+            <w:r>
+              <w:rPr>
+                <w:sz w:val="16"/>
+              </w:rPr>
+              <w:t>Confirmé (pages OffSec)</w:t>
+            </w:r>
+          </w:p>
+        </w:tc>
+        <w:tc>
+          <w:tcPr>
+            <w:tcW w:type="dxa" w:w="4082"/>
+            <w:shd w:val="clear" w:color="auto" w:fill="E3F2E8"/>
+          </w:tcPr>
+          <w:p>
+            <w:pPr>
+              <w:spacing w:after="0"/>
+            </w:pPr>
+            <w:r/>
+            <w:r>
+              <w:rPr>
+                <w:sz w:val="16"/>
+              </w:rPr>
+              <w:t>-</w:t>
+            </w:r>
+          </w:p>
+        </w:tc>
+      </w:tr>
+      <w:tr>
+        <w:trPr>
+          <w:cantSplit w:val="true"/>
+        </w:trPr>
+        <w:tc>
+          <w:tcPr>
+            <w:tcW w:type="dxa" w:w="3515"/>
+            <w:shd w:val="clear" w:color="auto" w:fill="E3F2E8"/>
+          </w:tcPr>
+          <w:p>
+            <w:pPr>
+              <w:spacing w:after="0"/>
+            </w:pPr>
+            <w:r/>
+            <w:r>
+              <w:rPr>
+                <w:sz w:val="16"/>
+              </w:rPr>
+              <w:t>Lab CETP : 449 $ (30 j), 649 $ (60 j), 849 $ (90 j)</w:t>
+            </w:r>
+          </w:p>
+        </w:tc>
+        <w:tc>
+          <w:tcPr>
+            <w:tcW w:type="dxa" w:w="2041"/>
+            <w:shd w:val="clear" w:color="auto" w:fill="E3F2E8"/>
+          </w:tcPr>
+          <w:p>
+            <w:pPr>
+              <w:spacing w:after="0"/>
+            </w:pPr>
+            <w:r/>
+            <w:r>
+              <w:rPr>
+                <w:sz w:val="16"/>
+              </w:rPr>
+              <w:t>Confirmé (page officielle Altered Security, non datée)</w:t>
+            </w:r>
+          </w:p>
+        </w:tc>
+        <w:tc>
+          <w:tcPr>
+            <w:tcW w:type="dxa" w:w="4082"/>
+            <w:shd w:val="clear" w:color="auto" w:fill="E3F2E8"/>
+          </w:tcPr>
+          <w:p>
+            <w:pPr>
+              <w:spacing w:after="0"/>
+            </w:pPr>
+            <w:r/>
+            <w:r>
+              <w:rPr>
+                <w:sz w:val="16"/>
+              </w:rPr>
+              <w:t>Reprise d'examen à 99 $ ; une autre offre « bootcamp » à 549 $ pour 35 jours existe.</w:t>
+            </w:r>
+          </w:p>
+        </w:tc>
+      </w:tr>
+      <w:tr>
+        <w:trPr>
+          <w:cantSplit w:val="true"/>
+        </w:trPr>
+        <w:tc>
+          <w:tcPr>
+            <w:tcW w:type="dxa" w:w="3515"/>
+            <w:shd w:val="clear" w:color="auto" w:fill="E3F2E8"/>
+          </w:tcPr>
+          <w:p>
+            <w:pPr>
+              <w:spacing w:after="0"/>
+            </w:pPr>
+            <w:r/>
+            <w:r>
+              <w:rPr>
+                <w:sz w:val="16"/>
+              </w:rPr>
+              <w:t>Shinra : 14 machines, 12 drapeaux ; Ifrit : 10 machines, 7 drapeaux, évasion</w:t>
+            </w:r>
+          </w:p>
+        </w:tc>
+        <w:tc>
+          <w:tcPr>
+            <w:tcW w:type="dxa" w:w="2041"/>
+            <w:shd w:val="clear" w:color="auto" w:fill="E3F2E8"/>
+          </w:tcPr>
+          <w:p>
+            <w:pPr>
+              <w:spacing w:after="0"/>
+            </w:pPr>
+            <w:r/>
+            <w:r>
+              <w:rPr>
+                <w:sz w:val="16"/>
+              </w:rPr>
+              <w:t>Confirmé (journal HackTheBox)</w:t>
+            </w:r>
+          </w:p>
+        </w:tc>
+        <w:tc>
+          <w:tcPr>
+            <w:tcW w:type="dxa" w:w="4082"/>
+            <w:shd w:val="clear" w:color="auto" w:fill="E3F2E8"/>
+          </w:tcPr>
+          <w:p>
+            <w:pPr>
+              <w:spacing w:after="0"/>
+            </w:pPr>
+            <w:r/>
+            <w:r>
+              <w:rPr>
+                <w:sz w:val="16"/>
+              </w:rPr>
+              <w:t>La description officielle parle de contourner l'EDR et d'éviter la détection du SOC ; « EDR sur tous les postes » n'a pas été retrouvé tel quel.</w:t>
+            </w:r>
+          </w:p>
+        </w:tc>
+      </w:tr>
+      <w:tr>
+        <w:trPr>
+          <w:cantSplit w:val="true"/>
+        </w:trPr>
+        <w:tc>
+          <w:tcPr>
+            <w:tcW w:type="dxa" w:w="3515"/>
+            <w:shd w:val="clear" w:color="auto" w:fill="E3F2E8"/>
+          </w:tcPr>
+          <w:p>
+            <w:pPr>
+              <w:spacing w:after="0"/>
+            </w:pPr>
+            <w:r/>
+            <w:r>
+              <w:rPr>
+                <w:sz w:val="16"/>
+              </w:rPr>
+              <w:t>Write-ups des Pro Labs interdits, sauf POO, Xen, Ascension, RPG et Hades</w:t>
+            </w:r>
+          </w:p>
+        </w:tc>
+        <w:tc>
+          <w:tcPr>
+            <w:tcW w:type="dxa" w:w="2041"/>
+            <w:shd w:val="clear" w:color="auto" w:fill="E3F2E8"/>
+          </w:tcPr>
+          <w:p>
+            <w:pPr>
+              <w:spacing w:after="0"/>
+            </w:pPr>
+            <w:r/>
+            <w:r>
+              <w:rPr>
+                <w:sz w:val="16"/>
+              </w:rPr>
+              <w:t>Confirmé (règles de la plateforme HackTheBox)</w:t>
+            </w:r>
+          </w:p>
+        </w:tc>
+        <w:tc>
+          <w:tcPr>
+            <w:tcW w:type="dxa" w:w="4082"/>
+            <w:shd w:val="clear" w:color="auto" w:fill="E3F2E8"/>
+          </w:tcPr>
+          <w:p>
+            <w:pPr>
+              <w:spacing w:after="0"/>
+            </w:pPr>
+            <w:r/>
+            <w:r>
+              <w:rPr>
+                <w:sz w:val="16"/>
+              </w:rPr>
+              <w:t>-</w:t>
+            </w:r>
+          </w:p>
+        </w:tc>
+      </w:tr>
+      <w:tr>
+        <w:trPr>
+          <w:cantSplit w:val="true"/>
+        </w:trPr>
+        <w:tc>
+          <w:tcPr>
+            <w:tcW w:type="dxa" w:w="3515"/>
+            <w:shd w:val="clear" w:color="auto" w:fill="E3F2E8"/>
+          </w:tcPr>
+          <w:p>
+            <w:pPr>
+              <w:spacing w:after="0"/>
+            </w:pPr>
+            <w:r/>
+            <w:r>
+              <w:rPr>
+                <w:sz w:val="16"/>
+              </w:rPr>
+              <w:t>Cours EDR Internals &amp; Development de Maldev Academy : agent MaldevEdr, pilote ELAM, minifiltres, rappels noyau, ETW-TI</w:t>
+            </w:r>
+          </w:p>
+        </w:tc>
+        <w:tc>
+          <w:tcPr>
+            <w:tcW w:type="dxa" w:w="2041"/>
+            <w:shd w:val="clear" w:color="auto" w:fill="E3F2E8"/>
+          </w:tcPr>
+          <w:p>
+            <w:pPr>
+              <w:spacing w:after="0"/>
+            </w:pPr>
+            <w:r/>
+            <w:r>
+              <w:rPr>
+                <w:sz w:val="16"/>
+              </w:rPr>
+              <w:t>Confirmé (page du cours, programme, publications)</w:t>
+            </w:r>
+          </w:p>
+        </w:tc>
+        <w:tc>
+          <w:tcPr>
+            <w:tcW w:type="dxa" w:w="4082"/>
+            <w:shd w:val="clear" w:color="auto" w:fill="E3F2E8"/>
+          </w:tcPr>
+          <w:p>
+            <w:pPr>
+              <w:spacing w:after="0"/>
+            </w:pPr>
+            <w:r/>
+            <w:r>
+              <w:rPr>
+                <w:sz w:val="16"/>
+              </w:rPr>
+              <w:t>Prix, durée et prérequis non retrouvés. Ne pas confondre avec le cours homonyme de TrainSec.</w:t>
+            </w:r>
+          </w:p>
+        </w:tc>
+      </w:tr>
+      <w:tr>
+        <w:trPr>
+          <w:cantSplit w:val="true"/>
+        </w:trPr>
+        <w:tc>
+          <w:tcPr>
+            <w:tcW w:type="dxa" w:w="3515"/>
+            <w:shd w:val="clear" w:color="auto" w:fill="E3F2E8"/>
+          </w:tcPr>
+          <w:p>
+            <w:pPr>
+              <w:spacing w:after="0"/>
+            </w:pPr>
+            <w:r/>
+            <w:r>
+              <w:rPr>
+                <w:sz w:val="16"/>
+              </w:rPr>
+              <w:t>Référentiels PASSI 2.2 et PRIS 3.0 du 29 novembre 2024</w:t>
+            </w:r>
+          </w:p>
+        </w:tc>
+        <w:tc>
+          <w:tcPr>
+            <w:tcW w:type="dxa" w:w="2041"/>
+            <w:shd w:val="clear" w:color="auto" w:fill="E3F2E8"/>
+          </w:tcPr>
+          <w:p>
+            <w:pPr>
+              <w:spacing w:after="0"/>
+            </w:pPr>
+            <w:r/>
+            <w:r>
+              <w:rPr>
+                <w:sz w:val="16"/>
+              </w:rPr>
+              <w:t>Confirmé (ANSSI)</w:t>
+            </w:r>
+          </w:p>
+        </w:tc>
+        <w:tc>
+          <w:tcPr>
+            <w:tcW w:type="dxa" w:w="4082"/>
+            <w:shd w:val="clear" w:color="auto" w:fill="E3F2E8"/>
+          </w:tcPr>
+          <w:p>
+            <w:pPr>
+              <w:spacing w:after="0"/>
+            </w:pPr>
+            <w:r/>
+            <w:r>
+              <w:rPr>
+                <w:sz w:val="16"/>
+              </w:rPr>
+              <w:t>-</w:t>
+            </w:r>
+          </w:p>
+        </w:tc>
+      </w:tr>
+      <w:tr>
+        <w:trPr>
+          <w:cantSplit w:val="true"/>
+        </w:trPr>
+        <w:tc>
+          <w:tcPr>
+            <w:tcW w:type="dxa" w:w="3515"/>
+            <w:shd w:val="clear" w:color="auto" w:fill="E3F2E8"/>
+          </w:tcPr>
+          <w:p>
+            <w:pPr>
+              <w:spacing w:after="0"/>
+            </w:pPr>
+            <w:r/>
+            <w:r>
+              <w:rPr>
+                <w:sz w:val="16"/>
+              </w:rPr>
+              <w:t>DORA : applicable depuis le 17 janvier 2025 ; règlement délégué 2025/1190</w:t>
+            </w:r>
+          </w:p>
+        </w:tc>
+        <w:tc>
+          <w:tcPr>
+            <w:tcW w:type="dxa" w:w="2041"/>
+            <w:shd w:val="clear" w:color="auto" w:fill="E3F2E8"/>
+          </w:tcPr>
+          <w:p>
+            <w:pPr>
+              <w:spacing w:after="0"/>
+            </w:pPr>
+            <w:r/>
+            <w:r>
+              <w:rPr>
+                <w:sz w:val="16"/>
+              </w:rPr>
+              <w:t>Confirmé (règlement du 13 février 2025)</w:t>
+            </w:r>
+          </w:p>
+        </w:tc>
+        <w:tc>
+          <w:tcPr>
+            <w:tcW w:type="dxa" w:w="4082"/>
+            <w:shd w:val="clear" w:color="auto" w:fill="E3F2E8"/>
+          </w:tcPr>
+          <w:p>
+            <w:pPr>
+              <w:spacing w:after="0"/>
+            </w:pPr>
+            <w:r/>
+            <w:r>
+              <w:rPr>
+                <w:sz w:val="16"/>
+              </w:rPr>
+              <w:t>Date d'application de la norme technique : sources divergentes (juillet 2025 citée). À vérifier.</w:t>
+            </w:r>
+          </w:p>
+        </w:tc>
+      </w:tr>
+      <w:tr>
+        <w:trPr>
+          <w:cantSplit w:val="true"/>
+        </w:trPr>
+        <w:tc>
+          <w:tcPr>
+            <w:tcW w:type="dxa" w:w="3515"/>
+            <w:shd w:val="clear" w:color="auto" w:fill="E3F2E8"/>
+          </w:tcPr>
+          <w:p>
+            <w:pPr>
+              <w:spacing w:after="0"/>
+            </w:pPr>
+            <w:r/>
+            <w:r>
+              <w:rPr>
+                <w:sz w:val="16"/>
+              </w:rPr>
+              <w:t>Ludus avec Elastic Defend</w:t>
+            </w:r>
+          </w:p>
+        </w:tc>
+        <w:tc>
+          <w:tcPr>
+            <w:tcW w:type="dxa" w:w="2041"/>
+            <w:shd w:val="clear" w:color="auto" w:fill="E3F2E8"/>
+          </w:tcPr>
+          <w:p>
+            <w:pPr>
+              <w:spacing w:after="0"/>
+            </w:pPr>
+            <w:r/>
+            <w:r>
+              <w:rPr>
+                <w:sz w:val="16"/>
+              </w:rPr>
+              <w:t>Confirmé (Elastic Security Labs)</w:t>
+            </w:r>
+          </w:p>
+        </w:tc>
+        <w:tc>
+          <w:tcPr>
+            <w:tcW w:type="dxa" w:w="4082"/>
+            <w:shd w:val="clear" w:color="auto" w:fill="E3F2E8"/>
+          </w:tcPr>
+          <w:p>
+            <w:pPr>
+              <w:spacing w:after="0"/>
+            </w:pPr>
+            <w:r/>
+            <w:r>
+              <w:rPr>
+                <w:sz w:val="16"/>
+              </w:rPr>
+              <w:t>-</w:t>
+            </w:r>
+          </w:p>
+        </w:tc>
+      </w:tr>
+      <w:tr>
+        <w:trPr>
+          <w:cantSplit w:val="true"/>
+        </w:trPr>
+        <w:tc>
+          <w:tcPr>
+            <w:tcW w:type="dxa" w:w="3515"/>
+            <w:shd w:val="clear" w:color="auto" w:fill="FFF4D6"/>
+          </w:tcPr>
+          <w:p>
+            <w:pPr>
+              <w:spacing w:after="0"/>
+            </w:pPr>
+            <w:r/>
+            <w:r>
+              <w:rPr>
+                <w:sz w:val="16"/>
+              </w:rPr>
+              <w:t>Modern C : version antérieure gratuite, 3e édition payante</w:t>
+            </w:r>
+          </w:p>
+        </w:tc>
+        <w:tc>
+          <w:tcPr>
+            <w:tcW w:type="dxa" w:w="2041"/>
+            <w:shd w:val="clear" w:color="auto" w:fill="FFF4D6"/>
+          </w:tcPr>
+          <w:p>
+            <w:pPr>
+              <w:spacing w:after="0"/>
+            </w:pPr>
+            <w:r/>
+            <w:r>
+              <w:rPr>
+                <w:sz w:val="16"/>
+              </w:rPr>
+              <w:t>Partiel</w:t>
+            </w:r>
+          </w:p>
+        </w:tc>
+        <w:tc>
+          <w:tcPr>
+            <w:tcW w:type="dxa" w:w="4082"/>
+            <w:shd w:val="clear" w:color="auto" w:fill="FFF4D6"/>
+          </w:tcPr>
+          <w:p>
+            <w:pPr>
+              <w:spacing w:after="0"/>
+            </w:pPr>
+            <w:r/>
+            <w:r>
+              <w:rPr>
+                <w:sz w:val="16"/>
+              </w:rPr>
+              <w:t>3e édition (2025) payante confirmée ; le manuscrit est publié sous licence Creative Commons non commerciale, emplacement du téléchargement non confirmé.</w:t>
+            </w:r>
+          </w:p>
+        </w:tc>
+      </w:tr>
+      <w:tr>
+        <w:trPr>
+          <w:cantSplit w:val="true"/>
+        </w:trPr>
+        <w:tc>
+          <w:tcPr>
+            <w:tcW w:type="dxa" w:w="3515"/>
+            <w:shd w:val="clear" w:color="auto" w:fill="FBE0E0"/>
+          </w:tcPr>
+          <w:p>
+            <w:pPr>
+              <w:spacing w:after="0"/>
+            </w:pPr>
+            <w:r/>
+            <w:r>
+              <w:rPr>
+                <w:sz w:val="16"/>
+              </w:rPr>
+              <w:t>Offre Synacktiv « Red Teamer Pentester », 58 000 €, trois ans d'expérience, juillet 2026</w:t>
+            </w:r>
+          </w:p>
+        </w:tc>
+        <w:tc>
+          <w:tcPr>
+            <w:tcW w:type="dxa" w:w="2041"/>
+            <w:shd w:val="clear" w:color="auto" w:fill="FBE0E0"/>
+          </w:tcPr>
+          <w:p>
+            <w:pPr>
+              <w:spacing w:after="0"/>
+            </w:pPr>
+            <w:r/>
+            <w:r>
+              <w:rPr>
+                <w:sz w:val="16"/>
+              </w:rPr>
+              <w:t>Non retrouvée</w:t>
+            </w:r>
+          </w:p>
+        </w:tc>
+        <w:tc>
+          <w:tcPr>
+            <w:tcW w:type="dxa" w:w="4082"/>
+            <w:shd w:val="clear" w:color="auto" w:fill="FBE0E0"/>
+          </w:tcPr>
+          <w:p>
+            <w:pPr>
+              <w:spacing w:after="0"/>
+            </w:pPr>
+            <w:r/>
+            <w:r>
+              <w:rPr>
+                <w:sz w:val="16"/>
+              </w:rPr>
+              <w:t>Seule offre retrouvée : pentester, minimum 44 400 € brut, sans mention des trois ans. L'argument « trois ans d'expérience offensive exigés » repose sur une source non revérifiée : à prendre comme indicatif.</w:t>
+            </w:r>
+          </w:p>
+        </w:tc>
+      </w:tr>
+      <w:tr>
+        <w:trPr>
+          <w:cantSplit w:val="true"/>
+        </w:trPr>
+        <w:tc>
+          <w:tcPr>
+            <w:tcW w:type="dxa" w:w="3515"/>
+            <w:shd w:val="clear" w:color="auto" w:fill="FBE0E0"/>
+          </w:tcPr>
+          <w:p>
+            <w:pPr>
+              <w:spacing w:after="0"/>
+            </w:pPr>
+            <w:r/>
+            <w:r>
+              <w:rPr>
+                <w:sz w:val="16"/>
+              </w:rPr>
+              <w:t>Labs Push, Sidecar, Control, Intercept parus en janvier 2026</w:t>
+            </w:r>
+          </w:p>
+        </w:tc>
+        <w:tc>
+          <w:tcPr>
+            <w:tcW w:type="dxa" w:w="2041"/>
+            <w:shd w:val="clear" w:color="auto" w:fill="FBE0E0"/>
+          </w:tcPr>
+          <w:p>
+            <w:pPr>
+              <w:spacing w:after="0"/>
+            </w:pPr>
+            <w:r/>
+            <w:r>
+              <w:rPr>
+                <w:sz w:val="16"/>
+              </w:rPr>
+              <w:t>Non retrouvés</w:t>
+            </w:r>
+          </w:p>
+        </w:tc>
+        <w:tc>
+          <w:tcPr>
+            <w:tcW w:type="dxa" w:w="4082"/>
+            <w:shd w:val="clear" w:color="auto" w:fill="FBE0E0"/>
+          </w:tcPr>
+          <w:p>
+            <w:pPr>
+              <w:spacing w:after="0"/>
+            </w:pPr>
+            <w:r/>
+            <w:r>
+              <w:rPr>
+                <w:sz w:val="16"/>
+              </w:rPr>
+              <w:t>Absents des résultats sur le journal HackTheBox. Tu as confirmé y avoir accès : vérifie leur présence dans ta plateforme avant d'organiser l'automne autour de Push et Sidecar.</w:t>
+            </w:r>
+          </w:p>
+        </w:tc>
+      </w:tr>
+      <w:tr>
+        <w:trPr>
+          <w:cantSplit w:val="true"/>
+        </w:trPr>
+        <w:tc>
+          <w:tcPr>
+            <w:tcW w:type="dxa" w:w="3515"/>
+            <w:shd w:val="clear" w:color="auto" w:fill="FBE0E0"/>
+          </w:tcPr>
+          <w:p>
+            <w:pPr>
+              <w:spacing w:after="0"/>
+            </w:pPr>
+            <w:r/>
+            <w:r>
+              <w:rPr>
+                <w:sz w:val="16"/>
+              </w:rPr>
+              <w:t>Guide TIBER-FR version 5 de la Banque de France, mars 2025</w:t>
+            </w:r>
+          </w:p>
+        </w:tc>
+        <w:tc>
+          <w:tcPr>
+            <w:tcW w:type="dxa" w:w="2041"/>
+            <w:shd w:val="clear" w:color="auto" w:fill="FBE0E0"/>
+          </w:tcPr>
+          <w:p>
+            <w:pPr>
+              <w:spacing w:after="0"/>
+            </w:pPr>
+            <w:r/>
+            <w:r>
+              <w:rPr>
+                <w:sz w:val="16"/>
+              </w:rPr>
+              <w:t>Non confirmé</w:t>
+            </w:r>
+          </w:p>
+        </w:tc>
+        <w:tc>
+          <w:tcPr>
+            <w:tcW w:type="dxa" w:w="4082"/>
+            <w:shd w:val="clear" w:color="auto" w:fill="FBE0E0"/>
+          </w:tcPr>
+          <w:p>
+            <w:pPr>
+              <w:spacing w:after="0"/>
+            </w:pPr>
+            <w:r/>
+            <w:r>
+              <w:rPr>
+                <w:sz w:val="16"/>
+              </w:rPr>
+              <w:t>Le cadre TIBER-EU et DORA est confirmé, pas ce guide précis.</w:t>
+            </w:r>
+          </w:p>
+        </w:tc>
+      </w:tr>
+      <w:tr>
+        <w:trPr>
+          <w:cantSplit w:val="true"/>
+        </w:trPr>
+        <w:tc>
+          <w:tcPr>
+            <w:tcW w:type="dxa" w:w="3515"/>
+            <w:shd w:val="clear" w:color="auto" w:fill="FBE0E0"/>
+          </w:tcPr>
+          <w:p>
+            <w:pPr>
+              <w:spacing w:after="0"/>
+            </w:pPr>
+            <w:r/>
+            <w:r>
+              <w:rPr>
+                <w:sz w:val="16"/>
+              </w:rPr>
+              <w:t>OpenSecurityTraining2 gratuit</w:t>
+            </w:r>
+          </w:p>
+        </w:tc>
+        <w:tc>
+          <w:tcPr>
+            <w:tcW w:type="dxa" w:w="2041"/>
+            <w:shd w:val="clear" w:color="auto" w:fill="FBE0E0"/>
+          </w:tcPr>
+          <w:p>
+            <w:pPr>
+              <w:spacing w:after="0"/>
+            </w:pPr>
+            <w:r/>
+            <w:r>
+              <w:rPr>
+                <w:sz w:val="16"/>
+              </w:rPr>
+              <w:t>Non confirmé</w:t>
+            </w:r>
+          </w:p>
+        </w:tc>
+        <w:tc>
+          <w:tcPr>
+            <w:tcW w:type="dxa" w:w="4082"/>
+            <w:shd w:val="clear" w:color="auto" w:fill="FBE0E0"/>
+          </w:tcPr>
+          <w:p>
+            <w:pPr>
+              <w:spacing w:after="0"/>
+            </w:pPr>
+            <w:r/>
+            <w:r>
+              <w:rPr>
+                <w:sz w:val="16"/>
+              </w:rPr>
+              <w:t>Cours WinDbg et assembleur x86-64 confirmés ; gratuité non confirmée : à vérifier sur le site.</w:t>
+            </w:r>
+          </w:p>
+        </w:tc>
+      </w:tr>
+    </w:tbl>
+    <w:p>
+      <w:pPr>
+        <w:spacing w:after="40"/>
+      </w:pPr>
+    </w:p>
+    <w:p>
+      <w:r>
+        <w:rPr>
+          <w:i/>
+          <w:color w:val="555555"/>
+          <w:sz w:val="18"/>
+        </w:rPr>
+        <w:t>Non revérifié lors de cette passe : prix TryHackMe, Proving Grounds, CRTA, CARTP et Global Central Bank ; cours XINTRA à 1 950 $ ; prix Sektor7 ; offres XMCO, BNP Paribas et Euro-Information ; fourchettes de salaires. Légende : vert = confirmé, orange = partiel, rouge = non retrouvé.</w:t>
       </w:r>
     </w:p>
     <w:sectPr>
-      <w:footerReference w:type="default" r:id="rId10"/>
       <w:pgSz w:w="11906" w:h="16838"/>
       <w:pgMar w:top="1020" w:right="1134" w:bottom="1020" w:left="1134" w:header="720" w:footer="720" w:gutter="0"/>
       <w:cols w:space="720"/>
@@ -4223,7 +5567,7 @@
     <w:pPr>
       <w:keepNext/>
       <w:keepLines/>
-      <w:spacing w:before="280" w:after="80"/>
+      <w:spacing w:before="200" w:after="80"/>
       <w:outlineLvl w:val="0"/>
     </w:pPr>
     <w:rPr>

</xml_diff>

<commit_message>
Plan complet corrigé après contrôle des sources, emplois du temps de type collège, lab CRTO à vie et Push/Sidecar confirmés
Co-Authored-By: Claude Sonnet 5.5 <noreply@anthropic.com>
Claude-Session: https://claude.ai/code/session_01N3xc7BzoCjYjKrEFpJv8SX
</commit_message>
<xml_diff>
--- a/05-Plan-Carriere/Plan-carriere-Red-Team-2026-2028-essentiel.docx
+++ b/05-Plan-Carriere/Plan-carriere-Red-Team-2026-2028-essentiel.docx
@@ -2368,7 +2368,7 @@
               <w:rPr>
                 <w:sz w:val="17"/>
               </w:rPr>
-              <w:t>CRTO, avec C et Sektor7 en parallèle (conditions du lab CRTO vérifiées).</w:t>
+              <w:t>CRTO, avec C et Sektor7 en parallèle (lab CRTO à accès à vie, confirmé par toi).</w:t>
             </w:r>
           </w:p>
         </w:tc>
@@ -3716,10 +3716,10 @@
         <w:rPr>
           <w:b/>
         </w:rPr>
-        <w:t xml:space="preserve">Vérifier trois informations que je n'ai pas pu obtenir : </w:t>
+        <w:t xml:space="preserve">Vérifier deux informations que je n'ai pas pu obtenir : </w:t>
       </w:r>
       <w:r>
-        <w:t>les heures, la date d'expiration et le nombre de tentatives d'examen du lab CRTO ; le prix de renouvellement de ton abonnement HackTheBox historique face à HTB PRO ; les prérequis du cours EDR de Maldev Academy. Le calendrier des labs et les décisions D2 et D5 en dépendent. Une source tierce d'août 2026 annonce des labs CRTO sans expiration et des reprises d'examen gratuites : à confirmer dans ton espace Zero-Point.</w:t>
+        <w:t>le prix de renouvellement de ton abonnement HackTheBox historique face à HTB PRO ; les prérequis du cours EDR de Maldev Academy. La décision D5 en dépend.</w:t>
       </w:r>
     </w:p>
     <w:p>
@@ -3744,13 +3744,13 @@
           <w:color w:val="555555"/>
           <w:sz w:val="18"/>
         </w:rPr>
-        <w:t>Informations que tu m'as données le 14 octobre 2026 et que je n'ai pas pu vérifier : abonnement HackTheBox actif jusqu'au 8 octobre 2027 avec accès aux Pro Labs et Mini Pro Labs ; lab CRTO inclus dans ton achat ; cours EDR édité par Maldev Academy ; contrat d'apprentissage de deux ans au ministère sans activité offensive ; pas de mémoire ni de soutenance en M2 ; fin du travail à 16 h 30, retour vers 17 h 15, travail possible jusque vers 21 h. Contrôle des sources : annexe B.</w:t>
+        <w:t>Informations que tu m'as données le 14 octobre 2026 et que je n'ai pas pu vérifier : abonnement HackTheBox actif jusqu'au 8 octobre 2027 avec accès aux Pro Labs et Mini Pro Labs ; lab CRTO inclus dans ton achat, avec un accès à vie ; labs Push et Sidecar disponibles ; cours EDR édité par Maldev Academy ; contrat d'apprentissage de deux ans au ministère sans activité offensive ; pas de mémoire ni de soutenance en M2 ; fin du travail à 16 h 30, retour vers 17 h 15, travail possible jusque vers 21 h. Contrôle des sources : annexe B.</w:t>
       </w:r>
     </w:p>
     <w:p>
       <w:pPr>
         <w:sectPr>
-          <w:footerReference w:type="default" r:id="rId12"/>
+          <w:footerReference w:type="default" r:id="rId15"/>
           <w:pgSz w:w="11906" w:h="16838"/>
           <w:pgMar w:top="1020" w:right="1134" w:bottom="1020" w:left="1134" w:header="720" w:footer="720" w:gutter="0"/>
           <w:cols w:space="720"/>
@@ -3763,16 +3763,19 @@
         <w:pStyle w:val="Heading1"/>
       </w:pPr>
       <w:r>
-        <w:t>Annexe A. Plannings hebdomadaires jour par jour</w:t>
+        <w:t>Annexe A. Emplois du temps hebdomadaires</w:t>
       </w:r>
     </w:p>
     <w:p>
+      <w:pPr>
+        <w:spacing w:after="0"/>
+      </w:pPr>
       <w:r>
         <w:rPr>
           <w:i w:val="0"/>
           <w:sz w:val="19"/>
         </w:rPr>
-        <w:t>Chaque ligne est un jour, chaque bloc une séance avec son créneau et sa durée ; le total du jour est à droite. Les blocs du lundi au vendredi commencent à 18 h et finissent au plus tard à 20 h 30 ; le samedi commence à 9 h (hypothèse) ; le dimanche reste libre. Créneaux proposés (avis) : tu peux déplacer un bloc d'un jour à l'autre sans changer les totaux. Je n'ai pas tes horaires de fin de cours : les semaines d'école reprennent la même fenêtre, à vérifier.</w:t>
+        <w:t>Une page par phase : semaine d'entreprise à gauche, semaine d'école à droite. Chaque case indique la séance, son créneau et sa durée ; le dimanche reste libre. Créneaux proposés (avis) : tu peux déplacer un bloc d'un jour à l'autre sans changer les totaux. Je n'ai pas tes horaires de fin de cours : les semaines d'école reprennent la même fenêtre, à vérifier.</w:t>
       </w:r>
     </w:p>
     <w:p>
@@ -3782,7 +3785,7 @@
       <w:r>
         <w:drawing>
           <wp:inline xmlns:a="http://schemas.openxmlformats.org/drawingml/2006/main" xmlns:pic="http://schemas.openxmlformats.org/drawingml/2006/picture">
-            <wp:extent cx="7740000" cy="4855091"/>
+            <wp:extent cx="8640000" cy="5175446"/>
             <wp:docPr id="2" name="Picture 2"/>
             <wp:cNvGraphicFramePr>
               <a:graphicFrameLocks noChangeAspect="1"/>
@@ -3791,7 +3794,7 @@
               <a:graphicData uri="http://schemas.openxmlformats.org/drawingml/2006/picture">
                 <pic:pic>
                   <pic:nvPicPr>
-                    <pic:cNvPr id="0" name="planning_entreprise.png"/>
+                    <pic:cNvPr id="0" name="emploi_du_temps_1.png"/>
                     <pic:cNvPicPr/>
                   </pic:nvPicPr>
                   <pic:blipFill>
@@ -3803,7 +3806,7 @@
                   <pic:spPr>
                     <a:xfrm>
                       <a:off x="0" y="0"/>
-                      <a:ext cx="7740000" cy="4855091"/>
+                      <a:ext cx="8640000" cy="5175446"/>
                     </a:xfrm>
                     <a:prstGeom prst="rect"/>
                   </pic:spPr>
@@ -3826,7 +3829,7 @@
       <w:r>
         <w:drawing>
           <wp:inline xmlns:a="http://schemas.openxmlformats.org/drawingml/2006/main" xmlns:pic="http://schemas.openxmlformats.org/drawingml/2006/picture">
-            <wp:extent cx="7740000" cy="4855091"/>
+            <wp:extent cx="8640000" cy="5175446"/>
             <wp:docPr id="3" name="Picture 3"/>
             <wp:cNvGraphicFramePr>
               <a:graphicFrameLocks noChangeAspect="1"/>
@@ -3835,7 +3838,7 @@
               <a:graphicData uri="http://schemas.openxmlformats.org/drawingml/2006/picture">
                 <pic:pic>
                   <pic:nvPicPr>
-                    <pic:cNvPr id="0" name="planning_ecole.png"/>
+                    <pic:cNvPr id="0" name="emploi_du_temps_2.png"/>
                     <pic:cNvPicPr/>
                   </pic:nvPicPr>
                   <pic:blipFill>
@@ -3847,7 +3850,139 @@
                   <pic:spPr>
                     <a:xfrm>
                       <a:off x="0" y="0"/>
-                      <a:ext cx="7740000" cy="4855091"/>
+                      <a:ext cx="8640000" cy="5175446"/>
+                    </a:xfrm>
+                    <a:prstGeom prst="rect"/>
+                  </pic:spPr>
+                </pic:pic>
+              </a:graphicData>
+            </a:graphic>
+          </wp:inline>
+        </w:drawing>
+      </w:r>
+    </w:p>
+    <w:p>
+      <w:r>
+        <w:br w:type="page"/>
+      </w:r>
+    </w:p>
+    <w:p>
+      <w:pPr>
+        <w:jc w:val="center"/>
+      </w:pPr>
+      <w:r>
+        <w:drawing>
+          <wp:inline xmlns:a="http://schemas.openxmlformats.org/drawingml/2006/main" xmlns:pic="http://schemas.openxmlformats.org/drawingml/2006/picture">
+            <wp:extent cx="8640000" cy="5175446"/>
+            <wp:docPr id="4" name="Picture 4"/>
+            <wp:cNvGraphicFramePr>
+              <a:graphicFrameLocks noChangeAspect="1"/>
+            </wp:cNvGraphicFramePr>
+            <a:graphic>
+              <a:graphicData uri="http://schemas.openxmlformats.org/drawingml/2006/picture">
+                <pic:pic>
+                  <pic:nvPicPr>
+                    <pic:cNvPr id="0" name="emploi_du_temps_3.png"/>
+                    <pic:cNvPicPr/>
+                  </pic:nvPicPr>
+                  <pic:blipFill>
+                    <a:blip r:embed="rId12"/>
+                    <a:stretch>
+                      <a:fillRect/>
+                    </a:stretch>
+                  </pic:blipFill>
+                  <pic:spPr>
+                    <a:xfrm>
+                      <a:off x="0" y="0"/>
+                      <a:ext cx="8640000" cy="5175446"/>
+                    </a:xfrm>
+                    <a:prstGeom prst="rect"/>
+                  </pic:spPr>
+                </pic:pic>
+              </a:graphicData>
+            </a:graphic>
+          </wp:inline>
+        </w:drawing>
+      </w:r>
+    </w:p>
+    <w:p>
+      <w:r>
+        <w:br w:type="page"/>
+      </w:r>
+    </w:p>
+    <w:p>
+      <w:pPr>
+        <w:jc w:val="center"/>
+      </w:pPr>
+      <w:r>
+        <w:drawing>
+          <wp:inline xmlns:a="http://schemas.openxmlformats.org/drawingml/2006/main" xmlns:pic="http://schemas.openxmlformats.org/drawingml/2006/picture">
+            <wp:extent cx="8640000" cy="5175446"/>
+            <wp:docPr id="5" name="Picture 5"/>
+            <wp:cNvGraphicFramePr>
+              <a:graphicFrameLocks noChangeAspect="1"/>
+            </wp:cNvGraphicFramePr>
+            <a:graphic>
+              <a:graphicData uri="http://schemas.openxmlformats.org/drawingml/2006/picture">
+                <pic:pic>
+                  <pic:nvPicPr>
+                    <pic:cNvPr id="0" name="emploi_du_temps_4.png"/>
+                    <pic:cNvPicPr/>
+                  </pic:nvPicPr>
+                  <pic:blipFill>
+                    <a:blip r:embed="rId13"/>
+                    <a:stretch>
+                      <a:fillRect/>
+                    </a:stretch>
+                  </pic:blipFill>
+                  <pic:spPr>
+                    <a:xfrm>
+                      <a:off x="0" y="0"/>
+                      <a:ext cx="8640000" cy="5175446"/>
+                    </a:xfrm>
+                    <a:prstGeom prst="rect"/>
+                  </pic:spPr>
+                </pic:pic>
+              </a:graphicData>
+            </a:graphic>
+          </wp:inline>
+        </w:drawing>
+      </w:r>
+    </w:p>
+    <w:p>
+      <w:r>
+        <w:br w:type="page"/>
+      </w:r>
+    </w:p>
+    <w:p>
+      <w:pPr>
+        <w:jc w:val="center"/>
+      </w:pPr>
+      <w:r>
+        <w:drawing>
+          <wp:inline xmlns:a="http://schemas.openxmlformats.org/drawingml/2006/main" xmlns:pic="http://schemas.openxmlformats.org/drawingml/2006/picture">
+            <wp:extent cx="8640000" cy="5175446"/>
+            <wp:docPr id="6" name="Picture 6"/>
+            <wp:cNvGraphicFramePr>
+              <a:graphicFrameLocks noChangeAspect="1"/>
+            </wp:cNvGraphicFramePr>
+            <a:graphic>
+              <a:graphicData uri="http://schemas.openxmlformats.org/drawingml/2006/picture">
+                <pic:pic>
+                  <pic:nvPicPr>
+                    <pic:cNvPr id="0" name="emploi_du_temps_5.png"/>
+                    <pic:cNvPicPr/>
+                  </pic:nvPicPr>
+                  <pic:blipFill>
+                    <a:blip r:embed="rId14"/>
+                    <a:stretch>
+                      <a:fillRect/>
+                    </a:stretch>
+                  </pic:blipFill>
+                  <pic:spPr>
+                    <a:xfrm>
+                      <a:off x="0" y="0"/>
+                      <a:ext cx="8640000" cy="5175446"/>
                     </a:xfrm>
                     <a:prstGeom prst="rect"/>
                   </pic:spPr>
@@ -3882,7 +4017,7 @@
           <w:i w:val="0"/>
           <w:sz w:val="19"/>
         </w:rPr>
-        <w:t>Méthode et limite : la lecture directe des sites est impossible depuis cet environnement (les adresses ne se résolvent pas). Chaque affirmation a donc été recoupée par recherche web, à partir d'extraits de pages officielles ou de sources secondaires. « Confirmé » signifie que l'extrait d'une source citée dit la même chose ; ce n'est pas une lecture de la page complète. Les notes de réalisme, durées et classements sont des avis et ne se vérifient pas. Les corrections issues du contrôle sont déjà appliquées dans cette version essentielle ; le plan complet de 38 pages n'a pas été modifié.</w:t>
+        <w:t>Méthode et limite : la lecture directe des sites est impossible depuis cet environnement (les adresses ne se résolvent pas). Chaque affirmation a donc été recoupée par recherche web, à partir d'extraits de pages officielles ou de sources secondaires. « Confirmé » signifie que l'extrait d'une source citée dit la même chose ; ce n'est pas une lecture de la page complète. Les notes de réalisme, durées et classements sont des avis et ne se vérifient pas. Les corrections issues du contrôle sont déjà appliquées dans cette version essentielle ; elles le sont aussi dans le plan complet.</w:t>
       </w:r>
     </w:p>
     <w:tbl>
@@ -4198,7 +4333,7 @@
         <w:tc>
           <w:tcPr>
             <w:tcW w:type="dxa" w:w="3515"/>
-            <w:shd w:val="clear" w:color="auto" w:fill="FFF4D6"/>
+            <w:shd w:val="clear" w:color="auto" w:fill="E3F2E8"/>
           </w:tcPr>
           <w:p>
             <w:pPr>
@@ -4209,14 +4344,14 @@
               <w:rPr>
                 <w:sz w:val="16"/>
               </w:rPr>
-              <w:t>Lab CRTO : heures et expiration</w:t>
+              <w:t>Lab CRTO : inclus, accès à vie</w:t>
             </w:r>
           </w:p>
         </w:tc>
         <w:tc>
           <w:tcPr>
             <w:tcW w:type="dxa" w:w="2041"/>
-            <w:shd w:val="clear" w:color="auto" w:fill="FFF4D6"/>
+            <w:shd w:val="clear" w:color="auto" w:fill="E3F2E8"/>
           </w:tcPr>
           <w:p>
             <w:pPr>
@@ -4227,14 +4362,14 @@
               <w:rPr>
                 <w:sz w:val="16"/>
               </w:rPr>
-              <w:t>Partiel</w:t>
+              <w:t>Confirmé par toi</w:t>
             </w:r>
           </w:p>
         </w:tc>
         <w:tc>
           <w:tcPr>
             <w:tcW w:type="dxa" w:w="4082"/>
-            <w:shd w:val="clear" w:color="auto" w:fill="FFF4D6"/>
+            <w:shd w:val="clear" w:color="auto" w:fill="E3F2E8"/>
           </w:tcPr>
           <w:p>
             <w:pPr>
@@ -4245,7 +4380,66 @@
               <w:rPr>
                 <w:sz w:val="16"/>
               </w:rPr>
-              <w:t>Une source tierce d'août 2026 dit : labs sans expiration, reprises d'examen gratuites et illimitées. Aucune confirmation officielle : ta vérification reste nécessaire.</w:t>
+              <w:t>Cohérent avec une source tierce d'août 2026 (labs sans expiration, reprises d'examen gratuites et illimitées). Plan corrigé.</w:t>
+            </w:r>
+          </w:p>
+        </w:tc>
+      </w:tr>
+      <w:tr>
+        <w:trPr>
+          <w:cantSplit w:val="true"/>
+        </w:trPr>
+        <w:tc>
+          <w:tcPr>
+            <w:tcW w:type="dxa" w:w="3515"/>
+            <w:shd w:val="clear" w:color="auto" w:fill="E3F2E8"/>
+          </w:tcPr>
+          <w:p>
+            <w:pPr>
+              <w:spacing w:after="0"/>
+            </w:pPr>
+            <w:r/>
+            <w:r>
+              <w:rPr>
+                <w:sz w:val="16"/>
+              </w:rPr>
+              <w:t>Push et Sidecar disponibles</w:t>
+            </w:r>
+          </w:p>
+        </w:tc>
+        <w:tc>
+          <w:tcPr>
+            <w:tcW w:type="dxa" w:w="2041"/>
+            <w:shd w:val="clear" w:color="auto" w:fill="E3F2E8"/>
+          </w:tcPr>
+          <w:p>
+            <w:pPr>
+              <w:spacing w:after="0"/>
+            </w:pPr>
+            <w:r/>
+            <w:r>
+              <w:rPr>
+                <w:sz w:val="16"/>
+              </w:rPr>
+              <w:t>Confirmé par toi</w:t>
+            </w:r>
+          </w:p>
+        </w:tc>
+        <w:tc>
+          <w:tcPr>
+            <w:tcW w:type="dxa" w:w="4082"/>
+            <w:shd w:val="clear" w:color="auto" w:fill="E3F2E8"/>
+          </w:tcPr>
+          <w:p>
+            <w:pPr>
+              <w:spacing w:after="0"/>
+            </w:pPr>
+            <w:r/>
+            <w:r>
+              <w:rPr>
+                <w:sz w:val="16"/>
+              </w:rPr>
+              <w:t>La date de parution (janvier 2026) n'a pas été retrouvée par recherche ; sans conséquence puisque les labs sont disponibles.</w:t>
             </w:r>
           </w:p>
         </w:tc>
@@ -4917,65 +5111,6 @@
               <w:rPr>
                 <w:sz w:val="16"/>
               </w:rPr>
-              <w:t>Labs Push, Sidecar, Control, Intercept parus en janvier 2026</w:t>
-            </w:r>
-          </w:p>
-        </w:tc>
-        <w:tc>
-          <w:tcPr>
-            <w:tcW w:type="dxa" w:w="2041"/>
-            <w:shd w:val="clear" w:color="auto" w:fill="FBE0E0"/>
-          </w:tcPr>
-          <w:p>
-            <w:pPr>
-              <w:spacing w:after="0"/>
-            </w:pPr>
-            <w:r/>
-            <w:r>
-              <w:rPr>
-                <w:sz w:val="16"/>
-              </w:rPr>
-              <w:t>Non retrouvés</w:t>
-            </w:r>
-          </w:p>
-        </w:tc>
-        <w:tc>
-          <w:tcPr>
-            <w:tcW w:type="dxa" w:w="4082"/>
-            <w:shd w:val="clear" w:color="auto" w:fill="FBE0E0"/>
-          </w:tcPr>
-          <w:p>
-            <w:pPr>
-              <w:spacing w:after="0"/>
-            </w:pPr>
-            <w:r/>
-            <w:r>
-              <w:rPr>
-                <w:sz w:val="16"/>
-              </w:rPr>
-              <w:t>Absents des résultats sur le journal HackTheBox. Tu as confirmé y avoir accès : vérifie leur présence dans ta plateforme avant d'organiser l'automne autour de Push et Sidecar.</w:t>
-            </w:r>
-          </w:p>
-        </w:tc>
-      </w:tr>
-      <w:tr>
-        <w:trPr>
-          <w:cantSplit w:val="true"/>
-        </w:trPr>
-        <w:tc>
-          <w:tcPr>
-            <w:tcW w:type="dxa" w:w="3515"/>
-            <w:shd w:val="clear" w:color="auto" w:fill="FBE0E0"/>
-          </w:tcPr>
-          <w:p>
-            <w:pPr>
-              <w:spacing w:after="0"/>
-            </w:pPr>
-            <w:r/>
-            <w:r>
-              <w:rPr>
-                <w:sz w:val="16"/>
-              </w:rPr>
               <w:t>Guide TIBER-FR version 5 de la Banque de France, mars 2025</w:t>
             </w:r>
           </w:p>

</xml_diff>

<commit_message>
Ne garde que la version essentielle ; emplois du temps sans horaires
Co-Authored-By: Claude Sonnet 5.5 <noreply@anthropic.com>
Claude-Session: https://claude.ai/code/session_01N3xc7BzoCjYjKrEFpJv8SX
</commit_message>
<xml_diff>
--- a/05-Plan-Carriere/Plan-carriere-Red-Team-2026-2028-essentiel.docx
+++ b/05-Plan-Carriere/Plan-carriere-Red-Team-2026-2028-essentiel.docx
@@ -49,7 +49,7 @@
           <w:color w:val="555555"/>
           <w:sz w:val="19"/>
         </w:rPr>
-        <w:t>Cette version ne garde que ce qui sert à décider et à agir : l'ordre des formations, la semaine type, les labs retenus, les lacunes à combler, les risques et les dates de décision. Le détail complet (38 pages : notes de réalisme, comparatifs de prix, sources, créneaux horaires) reste dans le plan complet du même dossier. Convention : Confirmé = sourcé dans le plan complet ; Avis = jugement personnel ; Incertain = non vérifié. Le document ne contient aucun code ni aucune technique offensive.</w:t>
+        <w:t>Cette version ne garde que ce qui sert à décider et à agir : l'ordre des formations, la semaine type, les labs retenus, les lacunes à combler, les risques et les dates de décision. Convention : Confirmé = recoupé par recherche (voir l'annexe B) ; Avis = jugement personnel ; Incertain = non vérifié. Le document ne contient aucun code ni aucune technique offensive.</w:t>
       </w:r>
     </w:p>
     <w:p>
@@ -640,7 +640,7 @@
         <w:rPr>
           <w:i w:val="0"/>
         </w:rPr>
-        <w:t>Capacité réelle : environ 13 h par semaine en moyenne, soit 550 à 600 h utiles par an (avis). Semaine d'entreprise : 15 h. Semaine d'école : 9 h 30. Le dimanche reste libre dans toutes les phases. Les blocs du lundi au vendredi démarrent à 18 h et ne dépassent jamais 21 h ; le samedi commence à 9 h (hypothèse). À partir de mi-décembre, le mardi est consacré à la BSCP. Le schéma jour par jour avec les créneaux horaires est en annexe A.</w:t>
+        <w:t>Capacité réelle : environ 13 h par semaine en moyenne, soit 550 à 600 h utiles par an (avis). Semaine d'entreprise : 15 h. Semaine d'école : 9 h 30. Le dimanche reste libre dans toutes les phases. À partir de mi-décembre, le mardi est consacré à la BSCP. Ce qu'il faut faire chaque jour, phase par phase, est dans l'emploi du temps en annexe A.</w:t>
       </w:r>
     </w:p>
     <w:tbl>
@@ -3750,7 +3750,7 @@
     <w:p>
       <w:pPr>
         <w:sectPr>
-          <w:footerReference w:type="default" r:id="rId15"/>
+          <w:footerReference w:type="default" r:id="rId13"/>
           <w:pgSz w:w="11906" w:h="16838"/>
           <w:pgMar w:top="1020" w:right="1134" w:bottom="1020" w:left="1134" w:header="720" w:footer="720" w:gutter="0"/>
           <w:cols w:space="720"/>
@@ -3775,7 +3775,7 @@
           <w:i w:val="0"/>
           <w:sz w:val="19"/>
         </w:rPr>
-        <w:t>Une page par phase : semaine d'entreprise à gauche, semaine d'école à droite. Chaque case indique la séance, son créneau et sa durée ; le dimanche reste libre. Créneaux proposés (avis) : tu peux déplacer un bloc d'un jour à l'autre sans changer les totaux. Je n'ai pas tes horaires de fin de cours : les semaines d'école reprennent la même fenêtre, à vérifier.</w:t>
+        <w:t>Pour chaque phase, deux emplois du temps : la semaine d'entreprise (15 h) à gauche, la semaine d'école (9 h 30) à droite. Chaque case indique l'activité du jour et sa durée, dans l'ordre de la journée, de haut en bas ; le dimanche reste libre. Répartition proposée (avis) : tu peux déplacer une séance d'un jour à l'autre sans changer les totaux.</w:t>
       </w:r>
     </w:p>
     <w:p>
@@ -3785,7 +3785,7 @@
       <w:r>
         <w:drawing>
           <wp:inline xmlns:a="http://schemas.openxmlformats.org/drawingml/2006/main" xmlns:pic="http://schemas.openxmlformats.org/drawingml/2006/picture">
-            <wp:extent cx="8640000" cy="5175446"/>
+            <wp:extent cx="8280000" cy="5164752"/>
             <wp:docPr id="2" name="Picture 2"/>
             <wp:cNvGraphicFramePr>
               <a:graphicFrameLocks noChangeAspect="1"/>
@@ -3794,7 +3794,7 @@
               <a:graphicData uri="http://schemas.openxmlformats.org/drawingml/2006/picture">
                 <pic:pic>
                   <pic:nvPicPr>
-                    <pic:cNvPr id="0" name="emploi_du_temps_1.png"/>
+                    <pic:cNvPr id="0" name="edt_1.png"/>
                     <pic:cNvPicPr/>
                   </pic:nvPicPr>
                   <pic:blipFill>
@@ -3806,7 +3806,7 @@
                   <pic:spPr>
                     <a:xfrm>
                       <a:off x="0" y="0"/>
-                      <a:ext cx="8640000" cy="5175446"/>
+                      <a:ext cx="8280000" cy="5164752"/>
                     </a:xfrm>
                     <a:prstGeom prst="rect"/>
                   </pic:spPr>
@@ -3829,7 +3829,7 @@
       <w:r>
         <w:drawing>
           <wp:inline xmlns:a="http://schemas.openxmlformats.org/drawingml/2006/main" xmlns:pic="http://schemas.openxmlformats.org/drawingml/2006/picture">
-            <wp:extent cx="8640000" cy="5175446"/>
+            <wp:extent cx="8280000" cy="5164752"/>
             <wp:docPr id="3" name="Picture 3"/>
             <wp:cNvGraphicFramePr>
               <a:graphicFrameLocks noChangeAspect="1"/>
@@ -3838,7 +3838,7 @@
               <a:graphicData uri="http://schemas.openxmlformats.org/drawingml/2006/picture">
                 <pic:pic>
                   <pic:nvPicPr>
-                    <pic:cNvPr id="0" name="emploi_du_temps_2.png"/>
+                    <pic:cNvPr id="0" name="edt_2.png"/>
                     <pic:cNvPicPr/>
                   </pic:nvPicPr>
                   <pic:blipFill>
@@ -3850,7 +3850,7 @@
                   <pic:spPr>
                     <a:xfrm>
                       <a:off x="0" y="0"/>
-                      <a:ext cx="8640000" cy="5175446"/>
+                      <a:ext cx="8280000" cy="5164752"/>
                     </a:xfrm>
                     <a:prstGeom prst="rect"/>
                   </pic:spPr>
@@ -3873,7 +3873,7 @@
       <w:r>
         <w:drawing>
           <wp:inline xmlns:a="http://schemas.openxmlformats.org/drawingml/2006/main" xmlns:pic="http://schemas.openxmlformats.org/drawingml/2006/picture">
-            <wp:extent cx="8640000" cy="5175446"/>
+            <wp:extent cx="8280000" cy="2951287"/>
             <wp:docPr id="4" name="Picture 4"/>
             <wp:cNvGraphicFramePr>
               <a:graphicFrameLocks noChangeAspect="1"/>
@@ -3882,7 +3882,7 @@
               <a:graphicData uri="http://schemas.openxmlformats.org/drawingml/2006/picture">
                 <pic:pic>
                   <pic:nvPicPr>
-                    <pic:cNvPr id="0" name="emploi_du_temps_3.png"/>
+                    <pic:cNvPr id="0" name="edt_3.png"/>
                     <pic:cNvPicPr/>
                   </pic:nvPicPr>
                   <pic:blipFill>
@@ -3894,95 +3894,7 @@
                   <pic:spPr>
                     <a:xfrm>
                       <a:off x="0" y="0"/>
-                      <a:ext cx="8640000" cy="5175446"/>
-                    </a:xfrm>
-                    <a:prstGeom prst="rect"/>
-                  </pic:spPr>
-                </pic:pic>
-              </a:graphicData>
-            </a:graphic>
-          </wp:inline>
-        </w:drawing>
-      </w:r>
-    </w:p>
-    <w:p>
-      <w:r>
-        <w:br w:type="page"/>
-      </w:r>
-    </w:p>
-    <w:p>
-      <w:pPr>
-        <w:jc w:val="center"/>
-      </w:pPr>
-      <w:r>
-        <w:drawing>
-          <wp:inline xmlns:a="http://schemas.openxmlformats.org/drawingml/2006/main" xmlns:pic="http://schemas.openxmlformats.org/drawingml/2006/picture">
-            <wp:extent cx="8640000" cy="5175446"/>
-            <wp:docPr id="5" name="Picture 5"/>
-            <wp:cNvGraphicFramePr>
-              <a:graphicFrameLocks noChangeAspect="1"/>
-            </wp:cNvGraphicFramePr>
-            <a:graphic>
-              <a:graphicData uri="http://schemas.openxmlformats.org/drawingml/2006/picture">
-                <pic:pic>
-                  <pic:nvPicPr>
-                    <pic:cNvPr id="0" name="emploi_du_temps_4.png"/>
-                    <pic:cNvPicPr/>
-                  </pic:nvPicPr>
-                  <pic:blipFill>
-                    <a:blip r:embed="rId13"/>
-                    <a:stretch>
-                      <a:fillRect/>
-                    </a:stretch>
-                  </pic:blipFill>
-                  <pic:spPr>
-                    <a:xfrm>
-                      <a:off x="0" y="0"/>
-                      <a:ext cx="8640000" cy="5175446"/>
-                    </a:xfrm>
-                    <a:prstGeom prst="rect"/>
-                  </pic:spPr>
-                </pic:pic>
-              </a:graphicData>
-            </a:graphic>
-          </wp:inline>
-        </w:drawing>
-      </w:r>
-    </w:p>
-    <w:p>
-      <w:r>
-        <w:br w:type="page"/>
-      </w:r>
-    </w:p>
-    <w:p>
-      <w:pPr>
-        <w:jc w:val="center"/>
-      </w:pPr>
-      <w:r>
-        <w:drawing>
-          <wp:inline xmlns:a="http://schemas.openxmlformats.org/drawingml/2006/main" xmlns:pic="http://schemas.openxmlformats.org/drawingml/2006/picture">
-            <wp:extent cx="8640000" cy="5175446"/>
-            <wp:docPr id="6" name="Picture 6"/>
-            <wp:cNvGraphicFramePr>
-              <a:graphicFrameLocks noChangeAspect="1"/>
-            </wp:cNvGraphicFramePr>
-            <a:graphic>
-              <a:graphicData uri="http://schemas.openxmlformats.org/drawingml/2006/picture">
-                <pic:pic>
-                  <pic:nvPicPr>
-                    <pic:cNvPr id="0" name="emploi_du_temps_5.png"/>
-                    <pic:cNvPicPr/>
-                  </pic:nvPicPr>
-                  <pic:blipFill>
-                    <a:blip r:embed="rId14"/>
-                    <a:stretch>
-                      <a:fillRect/>
-                    </a:stretch>
-                  </pic:blipFill>
-                  <pic:spPr>
-                    <a:xfrm>
-                      <a:off x="0" y="0"/>
-                      <a:ext cx="8640000" cy="5175446"/>
+                      <a:ext cx="8280000" cy="2951287"/>
                     </a:xfrm>
                     <a:prstGeom prst="rect"/>
                   </pic:spPr>
@@ -4017,7 +3929,7 @@
           <w:i w:val="0"/>
           <w:sz w:val="19"/>
         </w:rPr>
-        <w:t>Méthode et limite : la lecture directe des sites est impossible depuis cet environnement (les adresses ne se résolvent pas). Chaque affirmation a donc été recoupée par recherche web, à partir d'extraits de pages officielles ou de sources secondaires. « Confirmé » signifie que l'extrait d'une source citée dit la même chose ; ce n'est pas une lecture de la page complète. Les notes de réalisme, durées et classements sont des avis et ne se vérifient pas. Les corrections issues du contrôle sont déjà appliquées dans cette version essentielle ; elles le sont aussi dans le plan complet.</w:t>
+        <w:t>Méthode et limite : la lecture directe des sites est impossible depuis cet environnement (les adresses ne se résolvent pas). Chaque affirmation a donc été recoupée par recherche web, à partir d'extraits de pages officielles ou de sources secondaires. « Confirmé » signifie que l'extrait d'une source citée dit la même chose ; ce n'est pas une lecture de la page complète. Les notes de réalisme, durées et classements sont des avis et ne se vérifient pas. Les corrections issues du contrôle sont appliquées dans ce document.</w:t>
       </w:r>
     </w:p>
     <w:tbl>

</xml_diff>

<commit_message>
Nouvel ordre du C : plateforme de l'école, puis Sektor7, projet n° 1 décalé, calendrier refait
Co-Authored-By: Claude Sonnet 5.5 <noreply@anthropic.com>
Claude-Session: https://claude.ai/code/session_01N3xc7BzoCjYjKrEFpJv8SX
</commit_message>
<xml_diff>
--- a/05-Plan-Carriere/Plan-carriere-Red-Team-2026-2028-essentiel.docx
+++ b/05-Plan-Carriere/Plan-carriere-Red-Team-2026-2028-essentiel.docx
@@ -72,7 +72,7 @@
         <w:t xml:space="preserve">Ton vrai déficit est le développement logiciel, pas l'Active Directory. </w:t>
       </w:r>
       <w:r>
-        <w:t>OSCP, CRTP, CRTE et trois ans d'infrastructure te placent déjà au-dessus de la plupart des Pro Labs HackTheBox. Le C est la lacune qui conditionne tout le volet développement d'outils.</w:t>
+        <w:t>OSCP, CRTP, CRTE et trois ans d'infrastructure te placent déjà au-dessus de la plupart des Pro Labs HackTheBox. Tu pars de zéro en C (0 exercice réussi sur 197 sur la plateforme de l'école) : c'est la lacune qui conditionne tout le volet développement d'outils.</w:t>
       </w:r>
     </w:p>
     <w:p>
@@ -117,7 +117,7 @@
         <w:t xml:space="preserve">Ordre des accès de développement : </w:t>
       </w:r>
       <w:r>
-        <w:t>Sektor7 Essentials (introduction courte), puis Maldev Academy (sans les doublons), puis EDR Internals, puis CRTL. « CRTO II » n'existe plus sous ce nom : c'est le cours Red Team Ops II, qui mène à la certification CRTL. CRTL et CETP se recoupent : vise l'une des deux, pas les deux.</w:t>
+        <w:t>le C d'abord (modules 1 à 12 de la plateforme de l'école), puis Sektor7 Essentials (introduction courte), puis Maldev Academy (sans les doublons), puis EDR Internals, puis CRTL. « CRTO II » n'existe plus sous ce nom : c'est le cours Red Team Ops II, qui mène à la certification CRTL. CRTL et CETP se recoupent : vise l'une des deux, pas les deux.</w:t>
       </w:r>
     </w:p>
     <w:p>
@@ -182,6 +182,17 @@
     </w:p>
     <w:p>
       <w:pPr>
+        <w:sectPr>
+          <w:footerReference w:type="default" r:id="rId13"/>
+          <w:pgSz w:w="11906" w:h="16838"/>
+          <w:pgMar w:top="1020" w:right="1134" w:bottom="1020" w:left="1134" w:header="720" w:footer="720" w:gutter="0"/>
+          <w:cols w:space="720"/>
+          <w:docGrid w:linePitch="360"/>
+        </w:sectPr>
+      </w:pPr>
+    </w:p>
+    <w:p>
+      <w:pPr>
         <w:pStyle w:val="Heading1"/>
       </w:pPr>
       <w:r>
@@ -195,7 +206,7 @@
       <w:r>
         <w:drawing>
           <wp:inline xmlns:a="http://schemas.openxmlformats.org/drawingml/2006/main" xmlns:pic="http://schemas.openxmlformats.org/drawingml/2006/picture">
-            <wp:extent cx="5400000" cy="3154455"/>
+            <wp:extent cx="8820000" cy="4909245"/>
             <wp:docPr id="1" name="Picture 1"/>
             <wp:cNvGraphicFramePr>
               <a:graphicFrameLocks noChangeAspect="1"/>
@@ -204,7 +215,7 @@
               <a:graphicData uri="http://schemas.openxmlformats.org/drawingml/2006/picture">
                 <pic:pic>
                   <pic:nvPicPr>
-                    <pic:cNvPr id="0" name="7d3cd3e090f9c3c4c7af7ba2dad7bb39c22aced2.png"/>
+                    <pic:cNvPr id="0" name="calendrier.png"/>
                     <pic:cNvPicPr/>
                   </pic:nvPicPr>
                   <pic:blipFill>
@@ -216,7 +227,7 @@
                   <pic:spPr>
                     <a:xfrm>
                       <a:off x="0" y="0"/>
-                      <a:ext cx="5400000" cy="3154455"/>
+                      <a:ext cx="8820000" cy="4909245"/>
                     </a:xfrm>
                     <a:prstGeom prst="rect"/>
                   </pic:spPr>
@@ -234,8 +245,18 @@
           <w:color w:val="555555"/>
           <w:sz w:val="18"/>
         </w:rPr>
-        <w:t>Calendrier d'octobre 2026 à l'été 2028 (avis). Les éléments hachurés sont conditionnels ou optionnels. D1 à D7 sont les points de décision de la section 6. L'abonnement HackTheBox expire le 8 octobre 2027.</w:t>
+        <w:t>Calendrier d'octobre 2026 à l'été 2028 (avis). Les éléments hachurés sont conditionnels ou optionnels. D1 à D7 sont les points de décision de la section 6 ; « critère C » : voir D4. L'abonnement HackTheBox expire le 8 octobre 2027. Le C passe avant Sektor7 : les dates du C et de Sektor7 dépendent de ton rythme réel (voir la section 5).</w:t>
       </w:r>
+    </w:p>
+    <w:p>
+      <w:pPr>
+        <w:sectPr>
+          <w:pgSz w:w="16838" w:h="11906" w:orient="landscape"/>
+          <w:pgMar w:top="850" w:right="1020" w:bottom="850" w:left="1020" w:header="720" w:footer="720" w:gutter="0"/>
+          <w:cols w:space="720"/>
+          <w:docGrid w:linePitch="360"/>
+        </w:sectPr>
+      </w:pPr>
     </w:p>
     <w:tbl>
       <w:tblPr>
@@ -267,7 +288,7 @@
               <w:rPr>
                 <w:b/>
                 <w:color w:val="FFFFFF"/>
-                <w:sz w:val="17"/>
+                <w:sz w:val="16"/>
               </w:rPr>
               <w:t>Semestre</w:t>
             </w:r>
@@ -284,7 +305,7 @@
               <w:rPr>
                 <w:b/>
                 <w:color w:val="FFFFFF"/>
-                <w:sz w:val="17"/>
+                <w:sz w:val="16"/>
               </w:rPr>
               <w:t>Objectif</w:t>
             </w:r>
@@ -301,7 +322,7 @@
               <w:rPr>
                 <w:b/>
                 <w:color w:val="FFFFFF"/>
-                <w:sz w:val="17"/>
+                <w:sz w:val="16"/>
               </w:rPr>
               <w:t>Formations et labs</w:t>
             </w:r>
@@ -318,7 +339,7 @@
               <w:rPr>
                 <w:b/>
                 <w:color w:val="FFFFFF"/>
-                <w:sz w:val="17"/>
+                <w:sz w:val="16"/>
               </w:rPr>
               <w:t>Livrables et critère de réussite</w:t>
             </w:r>
@@ -341,7 +362,7 @@
             <w:r>
               <w:rPr>
                 <w:b/>
-                <w:sz w:val="17"/>
+                <w:sz w:val="16"/>
               </w:rPr>
               <w:t>S1 : oct. 2026 à janv. 2027</w:t>
             </w:r>
@@ -358,7 +379,7 @@
             <w:r/>
             <w:r>
               <w:rPr>
-                <w:sz w:val="17"/>
+                <w:sz w:val="16"/>
               </w:rPr>
               <w:t>Réussir la BSCP sans perdre le fil du C.</w:t>
             </w:r>
@@ -375,9 +396,9 @@
             <w:r/>
             <w:r>
               <w:rPr>
-                <w:sz w:val="17"/>
+                <w:sz w:val="16"/>
               </w:rPr>
-              <w:t>BSCP. C et Sektor7 Essentials à 2 h 30 par semaine jusqu'à mi-décembre, puis pause. Labs : Push, Sidecar, un petit Mini Pro Lab.</w:t>
+              <w:t>BSCP. C (plateforme de l'école) à 2 h 30 par semaine jusqu'à mi-décembre, puis pause. Labs : Push, Sidecar, un petit Mini Pro Lab.</w:t>
             </w:r>
           </w:p>
         </w:tc>
@@ -392,9 +413,9 @@
             <w:r/>
             <w:r>
               <w:rPr>
-                <w:sz w:val="17"/>
+                <w:sz w:val="16"/>
               </w:rPr>
-              <w:t>Deux examens blancs BSCP réussis avant fin janvier. Deux rapports de lab privés. Dépôt d'exercices en C avec tests.</w:t>
+              <w:t>Deux examens blancs BSCP réussis avant fin janvier. Deux rapports de lab privés. Modules 1 à 6 de la plateforme de C terminés (environ 6 exercices par semaine).</w:t>
             </w:r>
           </w:p>
         </w:tc>
@@ -415,7 +436,7 @@
             <w:r>
               <w:rPr>
                 <w:b/>
-                <w:sz w:val="17"/>
+                <w:sz w:val="16"/>
               </w:rPr>
               <w:t>S2 : févr. à août 2027</w:t>
             </w:r>
@@ -432,9 +453,9 @@
             <w:r/>
             <w:r>
               <w:rPr>
-                <w:sz w:val="17"/>
+                <w:sz w:val="16"/>
               </w:rPr>
-              <w:t>Opérer discrètement avec un C2 et finir les bases du développement.</w:t>
+              <w:t>Opérer discrètement avec un C2 et finir les fondamentaux du C.</w:t>
             </w:r>
           </w:p>
         </w:tc>
@@ -449,9 +470,9 @@
             <w:r/>
             <w:r>
               <w:rPr>
-                <w:sz w:val="17"/>
+                <w:sz w:val="16"/>
               </w:rPr>
-              <w:t>CRTO (examen en juin). RastaLabs, puis début de Shinra. Fin de Sektor7. Maldev Academy dès fin juin.</w:t>
+              <w:t>CRTO (examen en juin). RastaLabs, puis début de Shinra. C : modules 7 à 12 (fin entre mi-avril et fin juin), puis Sektor7 Essentials (mai à juillet).</w:t>
             </w:r>
           </w:p>
         </w:tc>
@@ -466,9 +487,9 @@
             <w:r/>
             <w:r>
               <w:rPr>
-                <w:sz w:val="17"/>
+                <w:sz w:val="16"/>
               </w:rPr>
-              <w:t>CRTO obtenu avant fin juin. Rapport RastaLabs relu par un pair. Premier projet C public avec tests et intégration continue. Premier article de blog.</w:t>
+              <w:t>CRTO obtenu avant fin juin. Rapport RastaLabs relu par un pair. Modules 1 à 12 du C terminés avant fin juin. Premier projet C public (juin à août) avec tests et intégration continue. Premier article de blog.</w:t>
             </w:r>
           </w:p>
         </w:tc>
@@ -489,7 +510,7 @@
             <w:r>
               <w:rPr>
                 <w:b/>
-                <w:sz w:val="17"/>
+                <w:sz w:val="16"/>
               </w:rPr>
               <w:t>S3 : sept. 2027 à janv. 2028</w:t>
             </w:r>
@@ -506,7 +527,7 @@
             <w:r/>
             <w:r>
               <w:rPr>
-                <w:sz w:val="17"/>
+                <w:sz w:val="16"/>
               </w:rPr>
               <w:t>Comprendre les défenses de l'intérieur.</w:t>
             </w:r>
@@ -523,9 +544,9 @@
             <w:r/>
             <w:r>
               <w:rPr>
-                <w:sz w:val="17"/>
+                <w:sz w:val="16"/>
               </w:rPr>
-              <w:t>Fin de Maldev Academy. EDR Internals &amp; Development. Fin de Shinra avant le 8 octobre. Reverse engineering (OpenSecurityTraining2). Candidatures dès janvier.</w:t>
+              <w:t>Maldev Academy (août et septembre, après Sektor7). EDR Internals &amp; Development. Fin de Shinra avant le 8 octobre. Reverse engineering (OpenSecurityTraining2). Candidatures dès janvier.</w:t>
             </w:r>
           </w:p>
         </w:tc>
@@ -540,7 +561,7 @@
             <w:r/>
             <w:r>
               <w:rPr>
-                <w:sz w:val="17"/>
+                <w:sz w:val="16"/>
               </w:rPr>
               <w:t>Deuxième projet logiciel. Notes sur l'architecture d'un EDR. Capacité d'expliquer à l'oral comment un EDR collecte sa télémétrie.</w:t>
             </w:r>
@@ -563,7 +584,7 @@
             <w:r>
               <w:rPr>
                 <w:b/>
-                <w:sz w:val="17"/>
+                <w:sz w:val="16"/>
               </w:rPr>
               <w:t>S4 : févr. à été 2028</w:t>
             </w:r>
@@ -580,7 +601,7 @@
             <w:r/>
             <w:r>
               <w:rPr>
-                <w:sz w:val="17"/>
+                <w:sz w:val="16"/>
               </w:rPr>
               <w:t>Certifier l'évasion, finaliser le portfolio, trouver un poste.</w:t>
             </w:r>
@@ -597,7 +618,7 @@
             <w:r/>
             <w:r>
               <w:rPr>
-                <w:sz w:val="17"/>
+                <w:sz w:val="16"/>
               </w:rPr>
               <w:t>CRTL (cours et lab de février à avril, examen en avril ou mai). Lab complémentaire selon la décision D7.</w:t>
             </w:r>
@@ -614,7 +635,7 @@
             <w:r/>
             <w:r>
               <w:rPr>
-                <w:sz w:val="17"/>
+                <w:sz w:val="16"/>
               </w:rPr>
               <w:t>CRTL obtenu. Portfolio finalisé (deux projets, quatre articles). Au moins trois entretiens techniques avant juin 2028.</w:t>
             </w:r>
@@ -672,7 +693,7 @@
               <w:rPr>
                 <w:b/>
                 <w:color w:val="FFFFFF"/>
-                <w:sz w:val="17"/>
+                <w:sz w:val="16"/>
               </w:rPr>
               <w:t>Phase</w:t>
             </w:r>
@@ -689,7 +710,7 @@
               <w:rPr>
                 <w:b/>
                 <w:color w:val="FFFFFF"/>
-                <w:sz w:val="17"/>
+                <w:sz w:val="16"/>
               </w:rPr>
               <w:t>Semaine d'entreprise (15 h)</w:t>
             </w:r>
@@ -706,7 +727,7 @@
               <w:rPr>
                 <w:b/>
                 <w:color w:val="FFFFFF"/>
-                <w:sz w:val="17"/>
+                <w:sz w:val="16"/>
               </w:rPr>
               <w:t>Semaine d'école (9 h 30)</w:t>
             </w:r>
@@ -729,7 +750,7 @@
             <w:r>
               <w:rPr>
                 <w:b/>
-                <w:sz w:val="17"/>
+                <w:sz w:val="16"/>
               </w:rPr>
               <w:t>Oct. à mi-déc. 2026</w:t>
             </w:r>
@@ -746,9 +767,9 @@
             <w:r/>
             <w:r>
               <w:rPr>
-                <w:sz w:val="17"/>
+                <w:sz w:val="16"/>
               </w:rPr>
-              <w:t>BSCP 6 h, lab 5 h, C et Sektor7 2 h 30, école 1 h, revue 30 min</w:t>
+              <w:t>BSCP 6 h, lab 5 h, C 2 h 30, école 1 h, revue 30 min</w:t>
             </w:r>
           </w:p>
         </w:tc>
@@ -763,7 +784,7 @@
             <w:r/>
             <w:r>
               <w:rPr>
-                <w:sz w:val="17"/>
+                <w:sz w:val="16"/>
               </w:rPr>
               <w:t>BSCP 4 h, lab 3 h, C 1 h, école 1 h, revue 30 min</w:t>
             </w:r>
@@ -786,7 +807,7 @@
             <w:r>
               <w:rPr>
                 <w:b/>
-                <w:sz w:val="17"/>
+                <w:sz w:val="16"/>
               </w:rPr>
               <w:t>Mi-déc. 2026 à début févr. 2027 (BSCP)</w:t>
             </w:r>
@@ -803,7 +824,7 @@
             <w:r/>
             <w:r>
               <w:rPr>
-                <w:sz w:val="17"/>
+                <w:sz w:val="16"/>
               </w:rPr>
               <w:t>BSCP 8 h 30, lab 5 h (arrêt 3 semaines avant l'examen), école 1 h, revue 30 min</w:t>
             </w:r>
@@ -820,7 +841,7 @@
             <w:r/>
             <w:r>
               <w:rPr>
-                <w:sz w:val="17"/>
+                <w:sz w:val="16"/>
               </w:rPr>
               <w:t>BSCP 6 h, lab 2 h, école 1 h, revue 30 min</w:t>
             </w:r>
@@ -843,7 +864,7 @@
             <w:r>
               <w:rPr>
                 <w:b/>
-                <w:sz w:val="17"/>
+                <w:sz w:val="16"/>
               </w:rPr>
               <w:t>Mi-févr. à juin 2027 (CRTO)</w:t>
             </w:r>
@@ -860,9 +881,9 @@
             <w:r/>
             <w:r>
               <w:rPr>
-                <w:sz w:val="17"/>
+                <w:sz w:val="16"/>
               </w:rPr>
-              <w:t>CRTO 4 h, lab 5 h, C et Sektor7 4 h, rédaction 1 h, école 30 min, revue 30 min</w:t>
+              <w:t>CRTO 4 h, lab 5 h, C puis Sektor7 4 h, rédaction 1 h, école 30 min, revue 30 min</w:t>
             </w:r>
           </w:p>
         </w:tc>
@@ -877,9 +898,9 @@
             <w:r/>
             <w:r>
               <w:rPr>
-                <w:sz w:val="17"/>
+                <w:sz w:val="16"/>
               </w:rPr>
-              <w:t>CRTO 3 h, lab 3 h, C 2 h, rédaction 30 min, école 30 min, revue 30 min</w:t>
+              <w:t>CRTO 3 h, lab 3 h, C puis Sektor7 2 h, rédaction 30 min, école 30 min, revue 30 min</w:t>
             </w:r>
           </w:p>
         </w:tc>
@@ -900,9 +921,9 @@
             <w:r>
               <w:rPr>
                 <w:b/>
-                <w:sz w:val="17"/>
+                <w:sz w:val="16"/>
               </w:rPr>
-              <w:t>Juil. 2027 à janv. 2028 (Maldev, EDR)</w:t>
+              <w:t>Juil. 2027 à janv. 2028 (Sektor7, Maldev, EDR)</w:t>
             </w:r>
           </w:p>
         </w:tc>
@@ -917,7 +938,7 @@
             <w:r/>
             <w:r>
               <w:rPr>
-                <w:sz w:val="17"/>
+                <w:sz w:val="16"/>
               </w:rPr>
               <w:t>Cours 4 h, lab 5 h, projet 2 h, reverse engineering 2 h, rédaction 1 h, revue 1 h</w:t>
             </w:r>
@@ -934,7 +955,7 @@
             <w:r/>
             <w:r>
               <w:rPr>
-                <w:sz w:val="17"/>
+                <w:sz w:val="16"/>
               </w:rPr>
               <w:t>Cours 3 h, lab 3 h, projet 1 h 30, reverse engineering 1 h, revue 1 h</w:t>
             </w:r>
@@ -957,7 +978,7 @@
             <w:r>
               <w:rPr>
                 <w:b/>
-                <w:sz w:val="17"/>
+                <w:sz w:val="16"/>
               </w:rPr>
               <w:t>Févr. à été 2028 (CRTL)</w:t>
             </w:r>
@@ -974,7 +995,7 @@
             <w:r/>
             <w:r>
               <w:rPr>
-                <w:sz w:val="17"/>
+                <w:sz w:val="16"/>
               </w:rPr>
               <w:t>CRTL 4 h, lab 5 h, projet 3 h, reverse engineering 1 h, rédaction et candidatures 1 h 30, revue 30 min</w:t>
             </w:r>
@@ -991,7 +1012,7 @@
             <w:r/>
             <w:r>
               <w:rPr>
-                <w:sz w:val="17"/>
+                <w:sz w:val="16"/>
               </w:rPr>
               <w:t>CRTL 3 h, lab 3 h, projet 2 h, candidatures 1 h, revue 30 min</w:t>
             </w:r>
@@ -1059,7 +1080,7 @@
               <w:rPr>
                 <w:b/>
                 <w:color w:val="FFFFFF"/>
-                <w:sz w:val="17"/>
+                <w:sz w:val="16"/>
               </w:rPr>
               <w:t>Période</w:t>
             </w:r>
@@ -1076,7 +1097,7 @@
               <w:rPr>
                 <w:b/>
                 <w:color w:val="FFFFFF"/>
-                <w:sz w:val="17"/>
+                <w:sz w:val="16"/>
               </w:rPr>
               <w:t>Lab</w:t>
             </w:r>
@@ -1093,7 +1114,7 @@
               <w:rPr>
                 <w:b/>
                 <w:color w:val="FFFFFF"/>
-                <w:sz w:val="17"/>
+                <w:sz w:val="16"/>
               </w:rPr>
               <w:t>Heures (avis)</w:t>
             </w:r>
@@ -1110,7 +1131,7 @@
               <w:rPr>
                 <w:b/>
                 <w:color w:val="FFFFFF"/>
-                <w:sz w:val="17"/>
+                <w:sz w:val="16"/>
               </w:rPr>
               <w:t>Pourquoi / condition</w:t>
             </w:r>
@@ -1133,7 +1154,7 @@
             <w:r>
               <w:rPr>
                 <w:b/>
-                <w:sz w:val="17"/>
+                <w:sz w:val="16"/>
               </w:rPr>
               <w:t>Oct. 2026</w:t>
             </w:r>
@@ -1150,7 +1171,7 @@
             <w:r/>
             <w:r>
               <w:rPr>
-                <w:sz w:val="17"/>
+                <w:sz w:val="16"/>
               </w:rPr>
               <w:t>Push (HTB)</w:t>
             </w:r>
@@ -1167,7 +1188,7 @@
             <w:r/>
             <w:r>
               <w:rPr>
-                <w:sz w:val="17"/>
+                <w:sz w:val="16"/>
               </w:rPr>
               <w:t>15 à 25</w:t>
             </w:r>
@@ -1184,7 +1205,7 @@
             <w:r/>
             <w:r>
               <w:rPr>
-                <w:sz w:val="17"/>
+                <w:sz w:val="16"/>
               </w:rPr>
               <w:t>ClickOnce, SCCM, ADCS : angles peu couverts par le CRTE. Format court, compatible BSCP.</w:t>
             </w:r>
@@ -1207,7 +1228,7 @@
             <w:r>
               <w:rPr>
                 <w:b/>
-                <w:sz w:val="17"/>
+                <w:sz w:val="16"/>
               </w:rPr>
               <w:t>Nov. à mi-déc. 2026</w:t>
             </w:r>
@@ -1224,7 +1245,7 @@
             <w:r/>
             <w:r>
               <w:rPr>
-                <w:sz w:val="17"/>
+                <w:sz w:val="16"/>
               </w:rPr>
               <w:t>Sidecar (HTB)</w:t>
             </w:r>
@@ -1241,7 +1262,7 @@
             <w:r/>
             <w:r>
               <w:rPr>
-                <w:sz w:val="17"/>
+                <w:sz w:val="16"/>
               </w:rPr>
               <w:t>15 à 25</w:t>
             </w:r>
@@ -1258,7 +1279,7 @@
             <w:r/>
             <w:r>
               <w:rPr>
-                <w:sz w:val="17"/>
+                <w:sz w:val="16"/>
               </w:rPr>
               <w:t>Infrastructure à clés publiques et persistance par certificats.</w:t>
             </w:r>
@@ -1281,7 +1302,7 @@
             <w:r>
               <w:rPr>
                 <w:b/>
-                <w:sz w:val="17"/>
+                <w:sz w:val="16"/>
               </w:rPr>
               <w:t>Mi-déc. 2026 à début janv. 2027</w:t>
             </w:r>
@@ -1298,7 +1319,7 @@
             <w:r/>
             <w:r>
               <w:rPr>
-                <w:sz w:val="17"/>
+                <w:sz w:val="16"/>
               </w:rPr>
               <w:t>Reflection ou Tengu (HTB)</w:t>
             </w:r>
@@ -1315,7 +1336,7 @@
             <w:r/>
             <w:r>
               <w:rPr>
-                <w:sz w:val="17"/>
+                <w:sz w:val="16"/>
               </w:rPr>
               <w:t>6 à 15</w:t>
             </w:r>
@@ -1332,7 +1353,7 @@
             <w:r/>
             <w:r>
               <w:rPr>
-                <w:sz w:val="17"/>
+                <w:sz w:val="16"/>
               </w:rPr>
               <w:t>Arrêt total du lab trois semaines avant l'examen BSCP.</w:t>
             </w:r>
@@ -1355,7 +1376,7 @@
             <w:r>
               <w:rPr>
                 <w:b/>
-                <w:sz w:val="17"/>
+                <w:sz w:val="16"/>
               </w:rPr>
               <w:t>Mi-févr. à mai 2027</w:t>
             </w:r>
@@ -1372,7 +1393,7 @@
             <w:r/>
             <w:r>
               <w:rPr>
-                <w:sz w:val="17"/>
+                <w:sz w:val="16"/>
               </w:rPr>
               <w:t>RastaLabs (HTB)</w:t>
             </w:r>
@@ -1389,7 +1410,7 @@
             <w:r/>
             <w:r>
               <w:rPr>
-                <w:sz w:val="17"/>
+                <w:sz w:val="16"/>
               </w:rPr>
               <w:t>55 à 65 (plafond 60)</w:t>
             </w:r>
@@ -1406,7 +1427,7 @@
             <w:r/>
             <w:r>
               <w:rPr>
-                <w:sz w:val="17"/>
+                <w:sz w:val="16"/>
               </w:rPr>
               <w:t>Utilisateurs simulés confirmés ; accès initial et opération en réseau. Version plafonnée (durée complète : 80 à 100 h).</w:t>
             </w:r>
@@ -1429,7 +1450,7 @@
             <w:r>
               <w:rPr>
                 <w:b/>
-                <w:sz w:val="17"/>
+                <w:sz w:val="16"/>
               </w:rPr>
               <w:t>Juin à sept. 2027</w:t>
             </w:r>
@@ -1446,7 +1467,7 @@
             <w:r/>
             <w:r>
               <w:rPr>
-                <w:sz w:val="17"/>
+                <w:sz w:val="16"/>
               </w:rPr>
               <w:t>Shinra (HTB)</w:t>
             </w:r>
@@ -1463,7 +1484,7 @@
             <w:r/>
             <w:r>
               <w:rPr>
-                <w:sz w:val="17"/>
+                <w:sz w:val="16"/>
               </w:rPr>
               <w:t>60 à 70 (plafond 65)</w:t>
             </w:r>
@@ -1480,7 +1501,7 @@
             <w:r/>
             <w:r>
               <w:rPr>
-                <w:sz w:val="17"/>
+                <w:sz w:val="16"/>
               </w:rPr>
               <w:t>EDR sur tous les postes et SOC permanent : le plus aligné sur l'évasion. À finir avant le 8 octobre 2027.</w:t>
             </w:r>
@@ -1503,7 +1524,7 @@
             <w:r>
               <w:rPr>
                 <w:b/>
-                <w:sz w:val="17"/>
+                <w:sz w:val="16"/>
               </w:rPr>
               <w:t>Oct. à déc. 2027</w:t>
             </w:r>
@@ -1520,7 +1541,7 @@
             <w:r/>
             <w:r>
               <w:rPr>
-                <w:sz w:val="17"/>
+                <w:sz w:val="16"/>
               </w:rPr>
               <w:t>Ifrit (HTB)</w:t>
             </w:r>
@@ -1537,7 +1558,7 @@
             <w:r/>
             <w:r>
               <w:rPr>
-                <w:sz w:val="17"/>
+                <w:sz w:val="16"/>
               </w:rPr>
               <w:t>40 à 60</w:t>
             </w:r>
@@ -1554,7 +1575,7 @@
             <w:r/>
             <w:r>
               <w:rPr>
-                <w:sz w:val="17"/>
+                <w:sz w:val="16"/>
               </w:rPr>
               <w:t>Seulement si l'abonnement est renouvelé (décision D5) ; sinon construction du banc Ludus avec Elastic Defend (gratuit).</w:t>
             </w:r>
@@ -1577,7 +1598,7 @@
             <w:r>
               <w:rPr>
                 <w:b/>
-                <w:sz w:val="17"/>
+                <w:sz w:val="16"/>
               </w:rPr>
               <w:t>Févr. à mai 2028</w:t>
             </w:r>
@@ -1594,7 +1615,7 @@
             <w:r/>
             <w:r>
               <w:rPr>
-                <w:sz w:val="17"/>
+                <w:sz w:val="16"/>
               </w:rPr>
               <w:t>Lab Red Team Ops II (CRTL)</w:t>
             </w:r>
@@ -1611,7 +1632,7 @@
             <w:r/>
             <w:r>
               <w:rPr>
-                <w:sz w:val="17"/>
+                <w:sz w:val="16"/>
               </w:rPr>
               <w:t>60 à 80</w:t>
             </w:r>
@@ -1628,7 +1649,7 @@
             <w:r/>
             <w:r>
               <w:rPr>
-                <w:sz w:val="17"/>
+                <w:sz w:val="16"/>
               </w:rPr>
               <w:t>Indispensable si tu choisis le CRTL. Prix actuel du lab incertain.</w:t>
             </w:r>
@@ -1651,7 +1672,7 @@
             <w:r>
               <w:rPr>
                 <w:b/>
-                <w:sz w:val="17"/>
+                <w:sz w:val="16"/>
               </w:rPr>
               <w:t>Mai à juin 2028</w:t>
             </w:r>
@@ -1668,7 +1689,7 @@
             <w:r/>
             <w:r>
               <w:rPr>
-                <w:sz w:val="17"/>
+                <w:sz w:val="16"/>
               </w:rPr>
               <w:t>Lab CETP, CARTP ou Cybernetics</w:t>
             </w:r>
@@ -1685,7 +1706,7 @@
             <w:r/>
             <w:r>
               <w:rPr>
-                <w:sz w:val="17"/>
+                <w:sz w:val="16"/>
               </w:rPr>
               <w:t>40 à 80</w:t>
             </w:r>
@@ -1702,7 +1723,7 @@
             <w:r/>
             <w:r>
               <w:rPr>
-                <w:sz w:val="17"/>
+                <w:sz w:val="16"/>
               </w:rPr>
               <w:t>Optionnel, selon la décision D7. CARTP seul élargit ton profil au cloud (Entra ID, Azure).</w:t>
             </w:r>
@@ -1769,7 +1790,7 @@
               <w:rPr>
                 <w:b/>
                 <w:color w:val="FFFFFF"/>
-                <w:sz w:val="17"/>
+                <w:sz w:val="16"/>
               </w:rPr>
               <w:t>Lacune</w:t>
             </w:r>
@@ -1786,7 +1807,7 @@
               <w:rPr>
                 <w:b/>
                 <w:color w:val="FFFFFF"/>
-                <w:sz w:val="17"/>
+                <w:sz w:val="16"/>
               </w:rPr>
               <w:t>Comment</w:t>
             </w:r>
@@ -1803,7 +1824,7 @@
               <w:rPr>
                 <w:b/>
                 <w:color w:val="FFFFFF"/>
-                <w:sz w:val="17"/>
+                <w:sz w:val="16"/>
               </w:rPr>
               <w:t>Temps</w:t>
             </w:r>
@@ -1820,7 +1841,7 @@
               <w:rPr>
                 <w:b/>
                 <w:color w:val="FFFFFF"/>
-                <w:sz w:val="17"/>
+                <w:sz w:val="16"/>
               </w:rPr>
               <w:t>Preuve attendue</w:t>
             </w:r>
@@ -1843,7 +1864,7 @@
             <w:r>
               <w:rPr>
                 <w:b/>
-                <w:sz w:val="17"/>
+                <w:sz w:val="16"/>
               </w:rPr>
               <w:t>Génie logiciel</w:t>
             </w:r>
@@ -1860,9 +1881,9 @@
             <w:r/>
             <w:r>
               <w:rPr>
-                <w:sz w:val="17"/>
+                <w:sz w:val="16"/>
               </w:rPr>
-              <w:t>C d'abord, puis sous-ensemble de C++ moderne (Rust après 2028). Documentation Win32. Avertissements maximaux, analyse statique, tests unitaires, intégration continue.</w:t>
+              <w:t>C d'abord : plateforme de l'école, modules 1 à 12 (141 exercices), puis Sektor7 Essentials, puis un sous-ensemble de C++ moderne (Rust après 2028). Documentation Win32. Avertissements maximaux, analyse statique, tests unitaires, intégration continue.</w:t>
             </w:r>
           </w:p>
         </w:tc>
@@ -1877,7 +1898,7 @@
             <w:r/>
             <w:r>
               <w:rPr>
-                <w:sz w:val="17"/>
+                <w:sz w:val="16"/>
               </w:rPr>
               <w:t>2 h 30 jusqu'à mi-déc. 2026, pause, puis 4 h dès mi-févr. 2027</w:t>
             </w:r>
@@ -1894,9 +1915,9 @@
             <w:r/>
             <w:r>
               <w:rPr>
-                <w:sz w:val="17"/>
+                <w:sz w:val="16"/>
               </w:rPr>
-              <w:t>Deux projets publics non offensifs ou orientés détection, avec tests, documentation et historique lisible.</w:t>
+              <w:t>Modules 1 à 12 terminés avant fin juin 2027. Deux projets publics non offensifs ou orientés détection, avec tests, documentation et historique lisible.</w:t>
             </w:r>
           </w:p>
         </w:tc>
@@ -1917,7 +1938,7 @@
             <w:r>
               <w:rPr>
                 <w:b/>
-                <w:sz w:val="17"/>
+                <w:sz w:val="16"/>
               </w:rPr>
               <w:t>Reverse engineering</w:t>
             </w:r>
@@ -1934,7 +1955,7 @@
             <w:r/>
             <w:r>
               <w:rPr>
-                <w:sz w:val="17"/>
+                <w:sz w:val="16"/>
               </w:rPr>
               <w:t>OpenSecurityTraining2 (gratuit), Ghidra, x64dbg, crackmes.</w:t>
             </w:r>
@@ -1951,7 +1972,7 @@
             <w:r/>
             <w:r>
               <w:rPr>
-                <w:sz w:val="17"/>
+                <w:sz w:val="16"/>
               </w:rPr>
               <w:t>2 h de juil. 2027 à janv. 2028, puis 1 h</w:t>
             </w:r>
@@ -1968,7 +1989,7 @@
             <w:r/>
             <w:r>
               <w:rPr>
-                <w:sz w:val="17"/>
+                <w:sz w:val="16"/>
               </w:rPr>
               <w:t>Six analyses écrites ; suivre un composant d'EDR Internals dans un débogueur.</w:t>
             </w:r>
@@ -1991,7 +2012,7 @@
             <w:r>
               <w:rPr>
                 <w:b/>
-                <w:sz w:val="17"/>
+                <w:sz w:val="16"/>
               </w:rPr>
               <w:t>Rapports et notes de synthèse</w:t>
             </w:r>
@@ -2008,7 +2029,7 @@
             <w:r/>
             <w:r>
               <w:rPr>
-                <w:sz w:val="17"/>
+                <w:sz w:val="16"/>
               </w:rPr>
               <w:t>Modèle de rapport type client, SysReptor (offre gratuite à contrôler). Une note de synthèse de deux pages par mois pour un décideur.</w:t>
             </w:r>
@@ -2025,7 +2046,7 @@
             <w:r/>
             <w:r>
               <w:rPr>
-                <w:sz w:val="17"/>
+                <w:sz w:val="16"/>
               </w:rPr>
               <w:t>1 h</w:t>
             </w:r>
@@ -2042,7 +2063,7 @@
             <w:r/>
             <w:r>
               <w:rPr>
-                <w:sz w:val="17"/>
+                <w:sz w:val="16"/>
               </w:rPr>
               <w:t>Quatre rapports relus d'ici août 2027 (privés) ; une note par mois relue par ton tuteur.</w:t>
             </w:r>
@@ -2065,7 +2086,7 @@
             <w:r>
               <w:rPr>
                 <w:b/>
-                <w:sz w:val="17"/>
+                <w:sz w:val="16"/>
               </w:rPr>
               <w:t>OPSEC</w:t>
             </w:r>
@@ -2082,7 +2103,7 @@
             <w:r/>
             <w:r>
               <w:rPr>
-                <w:sz w:val="17"/>
+                <w:sz w:val="16"/>
               </w:rPr>
               <w:t>Examen CRTO, banc Ludus avec Elastic Defend, règles de détection publiques (Elastic, Sigma, MITRE ATT&amp;CK).</w:t>
             </w:r>
@@ -2099,7 +2120,7 @@
             <w:r/>
             <w:r>
               <w:rPr>
-                <w:sz w:val="17"/>
+                <w:sz w:val="16"/>
               </w:rPr>
               <w:t>Intégré au lab, environ 1 h</w:t>
             </w:r>
@@ -2116,7 +2137,7 @@
             <w:r/>
             <w:r>
               <w:rPr>
-                <w:sz w:val="17"/>
+                <w:sz w:val="16"/>
               </w:rPr>
               <w:t>Journal de détection pour chaque lab dès Shinra : ce que la défense a vu, ce qu'elle aurait pu voir.</w:t>
             </w:r>
@@ -2128,6 +2149,15 @@
       <w:pPr>
         <w:spacing w:after="40"/>
       </w:pPr>
+    </w:p>
+    <w:p>
+      <w:r>
+        <w:rPr>
+          <w:i w:val="0"/>
+          <w:sz w:val="19"/>
+        </w:rPr>
+        <w:t>Rythme du C (avis, 25 à 40 min par exercice) : les modules 1 à 12 de la plateforme représentent 141 exercices, soit 59 à 94 h. Vise environ 6 exercices par semaine jusqu'à mi-décembre (modules 1 à 6), puis environ 10 par semaine dès mi-février. Tu termines alors entre mi-avril et fin juin 2027. Sektor7 démarre après le module 11 (mémoire dynamique), le premier projet C de juin à août 2027. Les modules 13 à 24 (algorithmique) sont un fond : commence par « Tri et recherche », « Structures de données » et « Algorithmique de la cybersécurité ». Note tes exercices réussis chaque dimanche.</w:t>
+      </w:r>
     </w:p>
     <w:p>
       <w:pPr>
@@ -2167,7 +2197,7 @@
               <w:rPr>
                 <w:b/>
                 <w:color w:val="FFFFFF"/>
-                <w:sz w:val="17"/>
+                <w:sz w:val="16"/>
               </w:rPr>
               <w:t>Code</w:t>
             </w:r>
@@ -2184,7 +2214,7 @@
               <w:rPr>
                 <w:b/>
                 <w:color w:val="FFFFFF"/>
-                <w:sz w:val="17"/>
+                <w:sz w:val="16"/>
               </w:rPr>
               <w:t>Date</w:t>
             </w:r>
@@ -2201,7 +2231,7 @@
               <w:rPr>
                 <w:b/>
                 <w:color w:val="FFFFFF"/>
-                <w:sz w:val="17"/>
+                <w:sz w:val="16"/>
               </w:rPr>
               <w:t>Décision</w:t>
             </w:r>
@@ -2218,7 +2248,7 @@
               <w:rPr>
                 <w:b/>
                 <w:color w:val="FFFFFF"/>
-                <w:sz w:val="17"/>
+                <w:sz w:val="16"/>
               </w:rPr>
               <w:t>Option par défaut (avis)</w:t>
             </w:r>
@@ -2241,7 +2271,7 @@
             <w:r>
               <w:rPr>
                 <w:b/>
-                <w:sz w:val="17"/>
+                <w:sz w:val="16"/>
               </w:rPr>
               <w:t>D1</w:t>
             </w:r>
@@ -2258,7 +2288,7 @@
             <w:r/>
             <w:r>
               <w:rPr>
-                <w:sz w:val="17"/>
+                <w:sz w:val="16"/>
               </w:rPr>
               <w:t>Fin nov. 2026</w:t>
             </w:r>
@@ -2275,7 +2305,7 @@
             <w:r/>
             <w:r>
               <w:rPr>
-                <w:sz w:val="17"/>
+                <w:sz w:val="16"/>
               </w:rPr>
               <w:t>Maintenir l'examen BSCP en février ?</w:t>
             </w:r>
@@ -2292,7 +2322,7 @@
             <w:r/>
             <w:r>
               <w:rPr>
-                <w:sz w:val="17"/>
+                <w:sz w:val="16"/>
               </w:rPr>
               <w:t>Oui si un examen blanc est réussi dans le temps imparti ; sinon décaler d'un mois au plus.</w:t>
             </w:r>
@@ -2315,7 +2345,7 @@
             <w:r>
               <w:rPr>
                 <w:b/>
-                <w:sz w:val="17"/>
+                <w:sz w:val="16"/>
               </w:rPr>
               <w:t>D2</w:t>
             </w:r>
@@ -2332,7 +2362,7 @@
             <w:r/>
             <w:r>
               <w:rPr>
-                <w:sz w:val="17"/>
+                <w:sz w:val="16"/>
               </w:rPr>
               <w:t>Mi-févr. 2027</w:t>
             </w:r>
@@ -2349,7 +2379,7 @@
             <w:r/>
             <w:r>
               <w:rPr>
-                <w:sz w:val="17"/>
+                <w:sz w:val="16"/>
               </w:rPr>
               <w:t>Quelle suite après la BSCP ?</w:t>
             </w:r>
@@ -2366,9 +2396,9 @@
             <w:r/>
             <w:r>
               <w:rPr>
-                <w:sz w:val="17"/>
+                <w:sz w:val="16"/>
               </w:rPr>
-              <w:t>CRTO, avec C et Sektor7 en parallèle (lab CRTO à accès à vie, confirmé par toi).</w:t>
+              <w:t>CRTO, avec le C en parallèle (Sektor7 dès le module 11 terminé ; lab CRTO à accès à vie, confirmé par toi).</w:t>
             </w:r>
           </w:p>
         </w:tc>
@@ -2389,7 +2419,7 @@
             <w:r>
               <w:rPr>
                 <w:b/>
-                <w:sz w:val="17"/>
+                <w:sz w:val="16"/>
               </w:rPr>
               <w:t>D3</w:t>
             </w:r>
@@ -2406,7 +2436,7 @@
             <w:r/>
             <w:r>
               <w:rPr>
-                <w:sz w:val="17"/>
+                <w:sz w:val="16"/>
               </w:rPr>
               <w:t>Mars 2027</w:t>
             </w:r>
@@ -2423,7 +2453,7 @@
             <w:r/>
             <w:r>
               <w:rPr>
-                <w:sz w:val="17"/>
+                <w:sz w:val="16"/>
               </w:rPr>
               <w:t>Quelles preuves hors emploi, lesquelles publier ?</w:t>
             </w:r>
@@ -2440,7 +2470,7 @@
             <w:r/>
             <w:r>
               <w:rPr>
-                <w:sz w:val="17"/>
+                <w:sz w:val="16"/>
               </w:rPr>
               <w:t>Publier uniquement après accord écrit de l'employeur ; sinon rapports privés partagés en entretien. Orienter un éventuel projet de M2 vers le Red Team.</w:t>
             </w:r>
@@ -2463,7 +2493,7 @@
             <w:r>
               <w:rPr>
                 <w:b/>
-                <w:sz w:val="17"/>
+                <w:sz w:val="16"/>
               </w:rPr>
               <w:t>D4</w:t>
             </w:r>
@@ -2480,7 +2510,7 @@
             <w:r/>
             <w:r>
               <w:rPr>
-                <w:sz w:val="17"/>
+                <w:sz w:val="16"/>
               </w:rPr>
               <w:t>Juin 2027</w:t>
             </w:r>
@@ -2497,7 +2527,7 @@
             <w:r/>
             <w:r>
               <w:rPr>
-                <w:sz w:val="17"/>
+                <w:sz w:val="16"/>
               </w:rPr>
               <w:t>CRTL ou CETP ?</w:t>
             </w:r>
@@ -2514,9 +2544,9 @@
             <w:r/>
             <w:r>
               <w:rPr>
-                <w:sz w:val="17"/>
+                <w:sz w:val="16"/>
               </w:rPr>
-              <w:t>CRTL. CETP seulement si nettement plus demandé dans 30 offres ciblées ou si un budget se libère.</w:t>
+              <w:t>CRTL. CETP seulement si nettement plus demandé dans 30 offres ciblées ou si un budget se libère. Critère C : modules 1 à 12 terminés fin juin 2027 ; sinon Maldev Academy et EDR Internals sont reportés et le CRTL est privilégié.</w:t>
             </w:r>
           </w:p>
         </w:tc>
@@ -2537,7 +2567,7 @@
             <w:r>
               <w:rPr>
                 <w:b/>
-                <w:sz w:val="17"/>
+                <w:sz w:val="16"/>
               </w:rPr>
               <w:t>D5</w:t>
             </w:r>
@@ -2554,7 +2584,7 @@
             <w:r/>
             <w:r>
               <w:rPr>
-                <w:sz w:val="17"/>
+                <w:sz w:val="16"/>
               </w:rPr>
               <w:t>15 sept. 2027</w:t>
             </w:r>
@@ -2571,7 +2601,7 @@
             <w:r/>
             <w:r>
               <w:rPr>
-                <w:sz w:val="17"/>
+                <w:sz w:val="16"/>
               </w:rPr>
               <w:t>Renouveler HackTheBox (expiration le 8 oct.) ?</w:t>
             </w:r>
@@ -2588,7 +2618,7 @@
             <w:r/>
             <w:r>
               <w:rPr>
-                <w:sz w:val="17"/>
+                <w:sz w:val="16"/>
               </w:rPr>
               <w:t>Oui si Ifrit ou Cybernetics restent à faire ; sinon basculer sur Ludus.</w:t>
             </w:r>
@@ -2611,7 +2641,7 @@
             <w:r>
               <w:rPr>
                 <w:b/>
-                <w:sz w:val="17"/>
+                <w:sz w:val="16"/>
               </w:rPr>
               <w:t>D6</w:t>
             </w:r>
@@ -2628,7 +2658,7 @@
             <w:r/>
             <w:r>
               <w:rPr>
-                <w:sz w:val="17"/>
+                <w:sz w:val="16"/>
               </w:rPr>
               <w:t>Mars 2028</w:t>
             </w:r>
@@ -2645,7 +2675,7 @@
             <w:r/>
             <w:r>
               <w:rPr>
-                <w:sz w:val="17"/>
+                <w:sz w:val="16"/>
               </w:rPr>
               <w:t>Type d'employeur visé en priorité</w:t>
             </w:r>
@@ -2662,7 +2692,7 @@
             <w:r/>
             <w:r>
               <w:rPr>
-                <w:sz w:val="17"/>
+                <w:sz w:val="16"/>
               </w:rPr>
               <w:t>Candidater en parallèle aux cabinets d'audit qualifiés PASSI et aux équipes internes bancaires.</w:t>
             </w:r>
@@ -2685,7 +2715,7 @@
             <w:r>
               <w:rPr>
                 <w:b/>
-                <w:sz w:val="17"/>
+                <w:sz w:val="16"/>
               </w:rPr>
               <w:t>D7</w:t>
             </w:r>
@@ -2702,7 +2732,7 @@
             <w:r/>
             <w:r>
               <w:rPr>
-                <w:sz w:val="17"/>
+                <w:sz w:val="16"/>
               </w:rPr>
               <w:t>Avril 2028</w:t>
             </w:r>
@@ -2719,7 +2749,7 @@
             <w:r/>
             <w:r>
               <w:rPr>
-                <w:sz w:val="17"/>
+                <w:sz w:val="16"/>
               </w:rPr>
               <w:t>Lab CETP, lab CARTP ou rien ?</w:t>
             </w:r>
@@ -2736,7 +2766,7 @@
             <w:r/>
             <w:r>
               <w:rPr>
-                <w:sz w:val="17"/>
+                <w:sz w:val="16"/>
               </w:rPr>
               <w:t>CARTP si le cloud apparaît dans plus d'un tiers des offres ; CETP en 60 jours seulement si le CRTL est acquis et le budget le permet.</w:t>
             </w:r>
@@ -2869,7 +2899,7 @@
               <w:rPr>
                 <w:b/>
                 <w:color w:val="FFFFFF"/>
-                <w:sz w:val="17"/>
+                <w:sz w:val="16"/>
               </w:rPr>
               <w:t>Risque</w:t>
             </w:r>
@@ -2886,7 +2916,7 @@
               <w:rPr>
                 <w:b/>
                 <w:color w:val="FFFFFF"/>
-                <w:sz w:val="17"/>
+                <w:sz w:val="16"/>
               </w:rPr>
               <w:t>Signal d'alerte</w:t>
             </w:r>
@@ -2903,7 +2933,7 @@
               <w:rPr>
                 <w:b/>
                 <w:color w:val="FFFFFF"/>
-                <w:sz w:val="17"/>
+                <w:sz w:val="16"/>
               </w:rPr>
               <w:t>Réaction</w:t>
             </w:r>
@@ -2926,7 +2956,7 @@
             <w:r>
               <w:rPr>
                 <w:b/>
-                <w:sz w:val="17"/>
+                <w:sz w:val="16"/>
               </w:rPr>
               <w:t>Surcharge</w:t>
             </w:r>
@@ -2943,7 +2973,7 @@
             <w:r/>
             <w:r>
               <w:rPr>
-                <w:sz w:val="17"/>
+                <w:sz w:val="16"/>
               </w:rPr>
               <w:t>Deux semaines consécutives sous 70 % des heures prévues, dimanche entamé, fatigue persistante.</w:t>
             </w:r>
@@ -2960,7 +2990,7 @@
             <w:r/>
             <w:r>
               <w:rPr>
-                <w:sz w:val="17"/>
+                <w:sz w:val="16"/>
               </w:rPr>
               <w:t>Supprimer le lab en premier (passer aux Mini Pro Labs), garder le cours et le projet. Ne jamais sacrifier le dimanche libre ni les deux semaines de congés d'été.</w:t>
             </w:r>
@@ -2983,7 +3013,7 @@
             <w:r>
               <w:rPr>
                 <w:b/>
-                <w:sz w:val="17"/>
+                <w:sz w:val="16"/>
               </w:rPr>
               <w:t>Dispersion</w:t>
             </w:r>
@@ -3000,7 +3030,7 @@
             <w:r/>
             <w:r>
               <w:rPr>
-                <w:sz w:val="17"/>
+                <w:sz w:val="16"/>
               </w:rPr>
               <w:t>Plus d'un cours, d'un lab ou d'un projet ouvert ; achat non prévu ; lab abandonné avant 70 %.</w:t>
             </w:r>
@@ -3017,7 +3047,7 @@
             <w:r/>
             <w:r>
               <w:rPr>
-                <w:sz w:val="17"/>
+                <w:sz w:val="16"/>
               </w:rPr>
               <w:t>Geler tout achat jusqu'au prochain point de décision. Terminer ou abandonner explicitement ce qui est ouvert.</w:t>
             </w:r>
@@ -3040,7 +3070,7 @@
             <w:r>
               <w:rPr>
                 <w:b/>
-                <w:sz w:val="17"/>
+                <w:sz w:val="16"/>
               </w:rPr>
               <w:t>Échec à la BSCP</w:t>
             </w:r>
@@ -3057,7 +3087,7 @@
             <w:r/>
             <w:r>
               <w:rPr>
-                <w:sz w:val="17"/>
+                <w:sz w:val="16"/>
               </w:rPr>
               <w:t>Examen blanc non réussi fin novembre, ou échec en février.</w:t>
             </w:r>
@@ -3074,7 +3104,7 @@
             <w:r/>
             <w:r>
               <w:rPr>
-                <w:sz w:val="17"/>
+                <w:sz w:val="16"/>
               </w:rPr>
               <w:t>Décaler d'un mois au plus ; en cas d'échec, une seule reprise sous six à huit semaines (99 $ selon une source tierce, à confirmer), CRTO à 2 h par semaine entre-temps.</w:t>
             </w:r>
@@ -3097,7 +3127,7 @@
             <w:r>
               <w:rPr>
                 <w:b/>
-                <w:sz w:val="17"/>
+                <w:sz w:val="16"/>
               </w:rPr>
               <w:t>Aucun offensif en alternance</w:t>
             </w:r>
@@ -3114,7 +3144,7 @@
             <w:r/>
             <w:r>
               <w:rPr>
-                <w:sz w:val="17"/>
+                <w:sz w:val="16"/>
               </w:rPr>
               <w:t>Aucune convocation après six mois de recherche (dès janvier 2028).</w:t>
             </w:r>
@@ -3131,7 +3161,7 @@
             <w:r/>
             <w:r>
               <w:rPr>
-                <w:sz w:val="17"/>
+                <w:sz w:val="16"/>
               </w:rPr>
               <w:t>Élargir au pentest généraliste et aux équipes de détection ou d'audit, puis revenir à l'offensif après un ou deux ans.</w:t>
             </w:r>
@@ -3191,7 +3221,7 @@
               <w:rPr>
                 <w:b/>
                 <w:color w:val="FFFFFF"/>
-                <w:sz w:val="17"/>
+                <w:sz w:val="16"/>
               </w:rPr>
               <w:t>Poste</w:t>
             </w:r>
@@ -3208,7 +3238,7 @@
               <w:rPr>
                 <w:b/>
                 <w:color w:val="FFFFFF"/>
-                <w:sz w:val="17"/>
+                <w:sz w:val="16"/>
               </w:rPr>
               <w:t>Prix trouvé</w:t>
             </w:r>
@@ -3225,7 +3255,7 @@
               <w:rPr>
                 <w:b/>
                 <w:color w:val="FFFFFF"/>
-                <w:sz w:val="17"/>
+                <w:sz w:val="16"/>
               </w:rPr>
               <w:t>Fiabilité</w:t>
             </w:r>
@@ -3242,7 +3272,7 @@
               <w:rPr>
                 <w:b/>
                 <w:color w:val="FFFFFF"/>
-                <w:sz w:val="17"/>
+                <w:sz w:val="16"/>
               </w:rPr>
               <w:t>Quand</w:t>
             </w:r>
@@ -3265,7 +3295,7 @@
             <w:r>
               <w:rPr>
                 <w:b/>
-                <w:sz w:val="17"/>
+                <w:sz w:val="16"/>
               </w:rPr>
               <w:t>Cours Red Team Ops II (CRTL)</w:t>
             </w:r>
@@ -3282,7 +3312,7 @@
             <w:r/>
             <w:r>
               <w:rPr>
-                <w:sz w:val="17"/>
+                <w:sz w:val="16"/>
               </w:rPr>
               <w:t>399 £</w:t>
             </w:r>
@@ -3299,7 +3329,7 @@
             <w:r/>
             <w:r>
               <w:rPr>
-                <w:sz w:val="17"/>
+                <w:sz w:val="16"/>
               </w:rPr>
               <w:t>Page non datée</w:t>
             </w:r>
@@ -3316,7 +3346,7 @@
             <w:r/>
             <w:r>
               <w:rPr>
-                <w:sz w:val="17"/>
+                <w:sz w:val="16"/>
               </w:rPr>
               <w:t>Janvier 2028</w:t>
             </w:r>
@@ -3339,7 +3369,7 @@
             <w:r>
               <w:rPr>
                 <w:b/>
-                <w:sz w:val="17"/>
+                <w:sz w:val="16"/>
               </w:rPr>
               <w:t>Lab Red Team Ops II</w:t>
             </w:r>
@@ -3356,7 +3386,7 @@
             <w:r/>
             <w:r>
               <w:rPr>
-                <w:sz w:val="17"/>
+                <w:sz w:val="16"/>
               </w:rPr>
               <w:t>15 £ par mois pour 40 h (2023)</w:t>
             </w:r>
@@ -3373,7 +3403,7 @@
             <w:r/>
             <w:r>
               <w:rPr>
-                <w:sz w:val="17"/>
+                <w:sz w:val="16"/>
               </w:rPr>
               <w:t>Incertain</w:t>
             </w:r>
@@ -3390,7 +3420,7 @@
             <w:r/>
             <w:r>
               <w:rPr>
-                <w:sz w:val="17"/>
+                <w:sz w:val="16"/>
               </w:rPr>
               <w:t>Février 2028</w:t>
             </w:r>
@@ -3413,7 +3443,7 @@
             <w:r>
               <w:rPr>
                 <w:b/>
-                <w:sz w:val="17"/>
+                <w:sz w:val="16"/>
               </w:rPr>
               <w:t>Lab CETP (optionnel)</w:t>
             </w:r>
@@ -3430,7 +3460,7 @@
             <w:r/>
             <w:r>
               <w:rPr>
-                <w:sz w:val="17"/>
+                <w:sz w:val="16"/>
               </w:rPr>
               <w:t>649 $ pour 60 jours (449 $ pour 30 j, 849 $ pour 90 j)</w:t>
             </w:r>
@@ -3447,7 +3477,7 @@
             <w:r/>
             <w:r>
               <w:rPr>
-                <w:sz w:val="17"/>
+                <w:sz w:val="16"/>
               </w:rPr>
               <w:t>Confirmé sur la page officielle, non datée</w:t>
             </w:r>
@@ -3464,7 +3494,7 @@
             <w:r/>
             <w:r>
               <w:rPr>
-                <w:sz w:val="17"/>
+                <w:sz w:val="16"/>
               </w:rPr>
               <w:t>Mai 2028 si D7</w:t>
             </w:r>
@@ -3487,7 +3517,7 @@
             <w:r>
               <w:rPr>
                 <w:b/>
-                <w:sz w:val="17"/>
+                <w:sz w:val="16"/>
               </w:rPr>
               <w:t>Renouvellement HackTheBox (optionnel)</w:t>
             </w:r>
@@ -3504,7 +3534,7 @@
             <w:r/>
             <w:r>
               <w:rPr>
-                <w:sz w:val="17"/>
+                <w:sz w:val="16"/>
               </w:rPr>
               <w:t>490 $ par an (HTB PRO)</w:t>
             </w:r>
@@ -3521,7 +3551,7 @@
             <w:r/>
             <w:r>
               <w:rPr>
-                <w:sz w:val="17"/>
+                <w:sz w:val="16"/>
               </w:rPr>
               <w:t>Confirmé ; prix de ta formule historique non vérifié</w:t>
             </w:r>
@@ -3538,7 +3568,7 @@
             <w:r/>
             <w:r>
               <w:rPr>
-                <w:sz w:val="17"/>
+                <w:sz w:val="16"/>
               </w:rPr>
               <w:t>8 octobre 2027 si D5</w:t>
             </w:r>
@@ -3561,7 +3591,7 @@
             <w:r>
               <w:rPr>
                 <w:b/>
-                <w:sz w:val="17"/>
+                <w:sz w:val="16"/>
               </w:rPr>
               <w:t>Lab CARTP (optionnel)</w:t>
             </w:r>
@@ -3578,7 +3608,7 @@
             <w:r/>
             <w:r>
               <w:rPr>
-                <w:sz w:val="17"/>
+                <w:sz w:val="16"/>
               </w:rPr>
               <w:t>Non trouvé</w:t>
             </w:r>
@@ -3595,7 +3625,7 @@
             <w:r/>
             <w:r>
               <w:rPr>
-                <w:sz w:val="17"/>
+                <w:sz w:val="16"/>
               </w:rPr>
               <w:t>Incertain</w:t>
             </w:r>
@@ -3612,7 +3642,7 @@
             <w:r/>
             <w:r>
               <w:rPr>
-                <w:sz w:val="17"/>
+                <w:sz w:val="16"/>
               </w:rPr>
               <w:t>Mai ou juin 2028 si D7</w:t>
             </w:r>
@@ -3635,7 +3665,7 @@
             <w:r>
               <w:rPr>
                 <w:b/>
-                <w:sz w:val="17"/>
+                <w:sz w:val="16"/>
               </w:rPr>
               <w:t>Reprise BSCP (si échec)</w:t>
             </w:r>
@@ -3652,7 +3682,7 @@
             <w:r/>
             <w:r>
               <w:rPr>
-                <w:sz w:val="17"/>
+                <w:sz w:val="16"/>
               </w:rPr>
               <w:t>99 $ = prix de l'examen</w:t>
             </w:r>
@@ -3669,7 +3699,7 @@
             <w:r/>
             <w:r>
               <w:rPr>
-                <w:sz w:val="17"/>
+                <w:sz w:val="16"/>
               </w:rPr>
               <w:t>Source tierce ; prix d'une reprise non trouvé</w:t>
             </w:r>
@@ -3686,7 +3716,7 @@
             <w:r/>
             <w:r>
               <w:rPr>
-                <w:sz w:val="17"/>
+                <w:sz w:val="16"/>
               </w:rPr>
               <w:t>Mars ou avril 2027</w:t>
             </w:r>
@@ -3738,6 +3768,21 @@
       </w:r>
     </w:p>
     <w:p>
+      <w:pPr>
+        <w:pStyle w:val="ListNumber"/>
+        <w:spacing w:after="40"/>
+      </w:pPr>
+      <w:r>
+        <w:rPr>
+          <w:b/>
+        </w:rPr>
+        <w:t xml:space="preserve">Mesurer ton temps réel par exercice : </w:t>
+      </w:r>
+      <w:r>
+        <w:t>sur la plateforme de C, pendant les deux premières semaines. Les dates du parcours du C et de Sektor7 en dépendent.</w:t>
+      </w:r>
+    </w:p>
+    <w:p>
       <w:r>
         <w:rPr>
           <w:i/>
@@ -3750,7 +3795,6 @@
     <w:p>
       <w:pPr>
         <w:sectPr>
-          <w:footerReference w:type="default" r:id="rId13"/>
           <w:pgSz w:w="11906" w:h="16838"/>
           <w:pgMar w:top="1020" w:right="1134" w:bottom="1020" w:left="1134" w:header="720" w:footer="720" w:gutter="0"/>
           <w:cols w:space="720"/>
@@ -5556,7 +5600,7 @@
     </w:pPr>
     <w:rPr>
       <w:rFonts w:ascii="Calibri" w:hAnsi="Calibri" w:eastAsia="Calibri"/>
-      <w:sz w:val="21"/>
+      <w:sz w:val="20"/>
     </w:rPr>
   </w:style>
   <w:style w:type="paragraph" w:styleId="Header">

</xml_diff>

<commit_message>
Tableau semaine type : retour aux valeurs d'origine
Co-Authored-By: Claude Sonnet 5.5 <noreply@anthropic.com>
Claude-Session: https://claude.ai/code/session_01N3xc7BzoCjYjKrEFpJv8SX
</commit_message>
<xml_diff>
--- a/05-Plan-Carriere/Plan-carriere-Red-Team-2026-2028-essentiel.docx
+++ b/05-Plan-Carriere/Plan-carriere-Red-Team-2026-2028-essentiel.docx
@@ -769,7 +769,7 @@
               <w:rPr>
                 <w:sz w:val="16"/>
               </w:rPr>
-              <w:t>BSCP 6 h, lab 5 h, C 2 h 30, école 1 h, revue 30 min</w:t>
+              <w:t>BSCP 6 h, lab 5 h, C et Sektor7 2 h 30, école 1 h, revue 30 min</w:t>
             </w:r>
           </w:p>
         </w:tc>
@@ -883,7 +883,7 @@
               <w:rPr>
                 <w:sz w:val="16"/>
               </w:rPr>
-              <w:t>CRTO 4 h, lab 5 h, C puis Sektor7 4 h, rédaction 1 h, école 30 min, revue 30 min</w:t>
+              <w:t>CRTO 4 h, lab 5 h, C et Sektor7 4 h, rédaction 1 h, école 30 min, revue 30 min</w:t>
             </w:r>
           </w:p>
         </w:tc>
@@ -900,7 +900,7 @@
               <w:rPr>
                 <w:sz w:val="16"/>
               </w:rPr>
-              <w:t>CRTO 3 h, lab 3 h, C puis Sektor7 2 h, rédaction 30 min, école 30 min, revue 30 min</w:t>
+              <w:t>CRTO 3 h, lab 3 h, C 2 h, rédaction 30 min, école 30 min, revue 30 min</w:t>
             </w:r>
           </w:p>
         </w:tc>
@@ -923,7 +923,7 @@
                 <w:b/>
                 <w:sz w:val="16"/>
               </w:rPr>
-              <w:t>Juil. 2027 à janv. 2028 (Sektor7, Maldev, EDR)</w:t>
+              <w:t>Juil. 2027 à janv. 2028 (Maldev, EDR)</w:t>
             </w:r>
           </w:p>
         </w:tc>

</xml_diff>

<commit_message>
Plannings : 3 h chaque soir, temps école remplacés par l'activité prévue, C terminé plus tôt, labs non plafonnés
Co-Authored-By: Claude Sonnet 5.5 <noreply@anthropic.com>
Claude-Session: https://claude.ai/code/session_01N3xc7BzoCjYjKrEFpJv8SX
</commit_message>
<xml_diff>
--- a/05-Plan-Carriere/Plan-carriere-Red-Team-2026-2028-essentiel.docx
+++ b/05-Plan-Carriere/Plan-carriere-Red-Team-2026-2028-essentiel.docx
@@ -132,7 +132,7 @@
         <w:t xml:space="preserve">Un cours, un lab et un projet logiciel ouverts à la fois, pas davantage. </w:t>
       </w:r>
       <w:r>
-        <w:t>Avec environ 170 h de lab d'ici l'expiration de ton abonnement HackTheBox (8 octobre 2027), tu peux faire quelques labs courts, puis RastaLabs et Shinra en version plafonnée.</w:t>
+        <w:t>Avec environ 260 h de lab d'ici l'expiration de ton abonnement HackTheBox (8 octobre 2027), tu peux faire quelques labs courts, puis RastaLabs et Shinra presque en entier ; Ifrit suppose un renouvellement.</w:t>
       </w:r>
     </w:p>
     <w:p>
@@ -245,7 +245,7 @@
           <w:color w:val="555555"/>
           <w:sz w:val="18"/>
         </w:rPr>
-        <w:t>Calendrier d'octobre 2026 à l'été 2028 (avis). Les éléments hachurés sont conditionnels ou optionnels. D1 à D7 sont les points de décision de la section 6 ; « critère C » : voir D4. L'abonnement HackTheBox expire le 8 octobre 2027. Le C passe avant Sektor7 : les dates du C et de Sektor7 dépendent de ton rythme réel (voir la section 5).</w:t>
+        <w:t>Calendrier d'octobre 2026 à l'été 2028 (avis). Les éléments hachurés sont conditionnels ou optionnels. D1 à D7 sont les points de décision de la section 6 ; « critère C » : voir D3. L'abonnement HackTheBox expire le 8 octobre 2027. Le C passe avant Sektor7 : les dates du C et de Sektor7 dépendent de ton rythme réel (voir la section 5).</w:t>
       </w:r>
     </w:p>
     <w:p>
@@ -381,7 +381,7 @@
               <w:rPr>
                 <w:sz w:val="16"/>
               </w:rPr>
-              <w:t>Réussir la BSCP sans perdre le fil du C.</w:t>
+              <w:t>Réussir la BSCP et faire la majeure partie du C.</w:t>
             </w:r>
           </w:p>
         </w:tc>
@@ -398,7 +398,7 @@
               <w:rPr>
                 <w:sz w:val="16"/>
               </w:rPr>
-              <w:t>BSCP. C (plateforme de l'école) à 2 h 30 par semaine jusqu'à mi-décembre, puis pause. Labs : Push, Sidecar, un petit Mini Pro Lab.</w:t>
+              <w:t>BSCP. C (plateforme de l'école) à 7 ou 8 h par semaine jusqu'à mi-décembre, puis pause. Labs : Push, Sidecar, un petit Mini Pro Lab.</w:t>
             </w:r>
           </w:p>
         </w:tc>
@@ -415,7 +415,7 @@
               <w:rPr>
                 <w:sz w:val="16"/>
               </w:rPr>
-              <w:t>Deux examens blancs BSCP réussis avant fin janvier. Deux rapports de lab privés. Modules 1 à 6 de la plateforme de C terminés (environ 6 exercices par semaine).</w:t>
+              <w:t>Deux examens blancs BSCP réussis avant fin janvier. Deux rapports de lab privés. Au moins 100 exercices sur 141 des modules 1 à 12 de la plateforme de C réussis avant la pause de mi-décembre.</w:t>
             </w:r>
           </w:p>
         </w:tc>
@@ -472,7 +472,7 @@
               <w:rPr>
                 <w:sz w:val="16"/>
               </w:rPr>
-              <w:t>CRTO (examen en juin). RastaLabs, puis début de Shinra. C : modules 7 à 12 (fin entre mi-avril et fin juin), puis Sektor7 Essentials (mai à juillet).</w:t>
+              <w:t>CRTO (examen en juin). RastaLabs, puis début de Shinra. Fin du C (au plus tard fin mars), puis Sektor7 Essentials (mars à mai). Maldev Academy dès fin juin.</w:t>
             </w:r>
           </w:p>
         </w:tc>
@@ -489,7 +489,7 @@
               <w:rPr>
                 <w:sz w:val="16"/>
               </w:rPr>
-              <w:t>CRTO obtenu avant fin juin. Rapport RastaLabs relu par un pair. Modules 1 à 12 du C terminés avant fin juin. Premier projet C public (juin à août) avec tests et intégration continue. Premier article de blog.</w:t>
+              <w:t>CRTO obtenu avant fin juin. Rapport RastaLabs relu par un pair. Modules 1 à 12 du C terminés avant fin mars. Premier projet C public (avril à juin) avec tests et intégration continue. Premier article de blog.</w:t>
             </w:r>
           </w:p>
         </w:tc>
@@ -546,7 +546,7 @@
               <w:rPr>
                 <w:sz w:val="16"/>
               </w:rPr>
-              <w:t>Maldev Academy (août et septembre, après Sektor7). EDR Internals &amp; Development. Fin de Shinra avant le 8 octobre. Reverse engineering (OpenSecurityTraining2). Candidatures dès janvier.</w:t>
+              <w:t>Fin de Maldev Academy. EDR Internals &amp; Development. Fin de Shinra avant le 8 octobre. Reverse engineering (OpenSecurityTraining2). Candidatures dès janvier.</w:t>
             </w:r>
           </w:p>
         </w:tc>
@@ -661,7 +661,7 @@
         <w:rPr>
           <w:i w:val="0"/>
         </w:rPr>
-        <w:t>Capacité réelle : environ 13 h par semaine en moyenne, soit 550 à 600 h utiles par an (avis). Semaine d'entreprise : 15 h. Semaine d'école : 9 h 30. Le dimanche reste libre dans toutes les phases. À partir de mi-décembre, le mardi est consacré à la BSCP. Ce qu'il faut faire chaque jour, phase par phase, est dans l'emploi du temps en annexe A.</w:t>
+        <w:t>Capacité : au moins 3 h chaque soir du lundi au vendredi (tu me l'as confirmé), plus le samedi ; le dimanche reste libre. Cela donne 19 h 30 à 20 h 30 par semaine d'entreprise et 17 h 30 à 19 h par semaine d'école selon la phase, soit environ 850 à 900 h utiles par an (avis). Les temps d'école ne sont plus comptés à part : ils sont remplacés par l'activité réellement prévue (C, projet, cours). À partir de mi-décembre, le mardi est consacré à la BSCP. Ce qu'il faut faire chaque jour est dans l'emploi du temps en annexe A.</w:t>
       </w:r>
     </w:p>
     <w:tbl>
@@ -674,9 +674,9 @@
         <w:tblW w:w="9639" w:type="dxa"/>
       </w:tblPr>
       <w:tblGrid>
-        <w:gridCol w:w="2381"/>
-        <w:gridCol w:w="3969"/>
-        <w:gridCol w:w="3288"/>
+        <w:gridCol w:w="2041"/>
+        <w:gridCol w:w="3912"/>
+        <w:gridCol w:w="3685"/>
       </w:tblGrid>
       <w:tr>
         <w:trPr>
@@ -684,7 +684,7 @@
         </w:trPr>
         <w:tc>
           <w:tcPr>
-            <w:tcW w:type="dxa" w:w="2381"/>
+            <w:tcW w:type="dxa" w:w="2041"/>
             <w:shd w:val="clear" w:color="auto" w:fill="1F3A5F"/>
           </w:tcPr>
           <w:p>
@@ -701,7 +701,7 @@
         </w:tc>
         <w:tc>
           <w:tcPr>
-            <w:tcW w:type="dxa" w:w="3969"/>
+            <w:tcW w:type="dxa" w:w="3912"/>
             <w:shd w:val="clear" w:color="auto" w:fill="1F3A5F"/>
           </w:tcPr>
           <w:p>
@@ -712,13 +712,13 @@
                 <w:color w:val="FFFFFF"/>
                 <w:sz w:val="16"/>
               </w:rPr>
-              <w:t>Semaine d'entreprise (15 h)</w:t>
+              <w:t>Semaine d'entreprise</w:t>
             </w:r>
           </w:p>
         </w:tc>
         <w:tc>
           <w:tcPr>
-            <w:tcW w:type="dxa" w:w="3288"/>
+            <w:tcW w:type="dxa" w:w="3685"/>
             <w:shd w:val="clear" w:color="auto" w:fill="1F3A5F"/>
           </w:tcPr>
           <w:p>
@@ -729,7 +729,7 @@
                 <w:color w:val="FFFFFF"/>
                 <w:sz w:val="16"/>
               </w:rPr>
-              <w:t>Semaine d'école (9 h 30)</w:t>
+              <w:t>Semaine d'école</w:t>
             </w:r>
           </w:p>
         </w:tc>
@@ -740,7 +740,7 @@
         </w:trPr>
         <w:tc>
           <w:tcPr>
-            <w:tcW w:type="dxa" w:w="2381"/>
+            <w:tcW w:type="dxa" w:w="2041"/>
           </w:tcPr>
           <w:p>
             <w:pPr>
@@ -758,7 +758,7 @@
         </w:tc>
         <w:tc>
           <w:tcPr>
-            <w:tcW w:type="dxa" w:w="3969"/>
+            <w:tcW w:type="dxa" w:w="3912"/>
           </w:tcPr>
           <w:p>
             <w:pPr>
@@ -769,13 +769,13 @@
               <w:rPr>
                 <w:sz w:val="16"/>
               </w:rPr>
-              <w:t>BSCP 6 h, lab 5 h, C et Sektor7 2 h 30, école 1 h, revue 30 min</w:t>
+              <w:t>20 h 30 : BSCP 7 h, lab 5 h 30, C 7 h 30, revue 30 min</w:t>
             </w:r>
           </w:p>
         </w:tc>
         <w:tc>
           <w:tcPr>
-            <w:tcW w:type="dxa" w:w="3288"/>
+            <w:tcW w:type="dxa" w:w="3685"/>
           </w:tcPr>
           <w:p>
             <w:pPr>
@@ -786,7 +786,7 @@
               <w:rPr>
                 <w:sz w:val="16"/>
               </w:rPr>
-              <w:t>BSCP 4 h, lab 3 h, C 1 h, école 1 h, revue 30 min</w:t>
+              <w:t>19 h : BSCP 6 h, lab 4 h, C 8 h 30, revue 30 min</w:t>
             </w:r>
           </w:p>
         </w:tc>
@@ -797,7 +797,7 @@
         </w:trPr>
         <w:tc>
           <w:tcPr>
-            <w:tcW w:type="dxa" w:w="2381"/>
+            <w:tcW w:type="dxa" w:w="2041"/>
           </w:tcPr>
           <w:p>
             <w:pPr>
@@ -815,7 +815,7 @@
         </w:tc>
         <w:tc>
           <w:tcPr>
-            <w:tcW w:type="dxa" w:w="3969"/>
+            <w:tcW w:type="dxa" w:w="3912"/>
           </w:tcPr>
           <w:p>
             <w:pPr>
@@ -826,13 +826,13 @@
               <w:rPr>
                 <w:sz w:val="16"/>
               </w:rPr>
-              <w:t>BSCP 8 h 30, lab 5 h (arrêt 3 semaines avant l'examen), école 1 h, revue 30 min</w:t>
+              <w:t>20 h : BSCP 13 h 30, lab 6 h, revue 30 min</w:t>
             </w:r>
           </w:p>
         </w:tc>
         <w:tc>
           <w:tcPr>
-            <w:tcW w:type="dxa" w:w="3288"/>
+            <w:tcW w:type="dxa" w:w="3685"/>
           </w:tcPr>
           <w:p>
             <w:pPr>
@@ -843,7 +843,7 @@
               <w:rPr>
                 <w:sz w:val="16"/>
               </w:rPr>
-              <w:t>BSCP 6 h, lab 2 h, école 1 h, revue 30 min</w:t>
+              <w:t>17 h 30 : BSCP 11 h, lab 6 h, revue 30 min</w:t>
             </w:r>
           </w:p>
         </w:tc>
@@ -854,7 +854,7 @@
         </w:trPr>
         <w:tc>
           <w:tcPr>
-            <w:tcW w:type="dxa" w:w="2381"/>
+            <w:tcW w:type="dxa" w:w="2041"/>
           </w:tcPr>
           <w:p>
             <w:pPr>
@@ -872,7 +872,7 @@
         </w:tc>
         <w:tc>
           <w:tcPr>
-            <w:tcW w:type="dxa" w:w="3969"/>
+            <w:tcW w:type="dxa" w:w="3912"/>
           </w:tcPr>
           <w:p>
             <w:pPr>
@@ -883,13 +883,13 @@
               <w:rPr>
                 <w:sz w:val="16"/>
               </w:rPr>
-              <w:t>CRTO 4 h, lab 5 h, C et Sektor7 4 h, rédaction 1 h, école 30 min, revue 30 min</w:t>
+              <w:t>19 h 30 : CRTO 5 h, lab 7 h 30, C puis Sektor7 5 h 30, rédaction 1 h, revue 30 min</w:t>
             </w:r>
           </w:p>
         </w:tc>
         <w:tc>
           <w:tcPr>
-            <w:tcW w:type="dxa" w:w="3288"/>
+            <w:tcW w:type="dxa" w:w="3685"/>
           </w:tcPr>
           <w:p>
             <w:pPr>
@@ -900,7 +900,7 @@
               <w:rPr>
                 <w:sz w:val="16"/>
               </w:rPr>
-              <w:t>CRTO 3 h, lab 3 h, C 2 h, rédaction 30 min, école 30 min, revue 30 min</w:t>
+              <w:t>18 h 30 : CRTO 6 h, lab 5 h, C puis Sektor7 6 h, rédaction 1 h, revue 30 min</w:t>
             </w:r>
           </w:p>
         </w:tc>
@@ -911,7 +911,7 @@
         </w:trPr>
         <w:tc>
           <w:tcPr>
-            <w:tcW w:type="dxa" w:w="2381"/>
+            <w:tcW w:type="dxa" w:w="2041"/>
           </w:tcPr>
           <w:p>
             <w:pPr>
@@ -929,7 +929,7 @@
         </w:tc>
         <w:tc>
           <w:tcPr>
-            <w:tcW w:type="dxa" w:w="3969"/>
+            <w:tcW w:type="dxa" w:w="3912"/>
           </w:tcPr>
           <w:p>
             <w:pPr>
@@ -940,13 +940,13 @@
               <w:rPr>
                 <w:sz w:val="16"/>
               </w:rPr>
-              <w:t>Cours 4 h, lab 5 h, projet 2 h, reverse engineering 2 h, rédaction 1 h, revue 1 h</w:t>
+              <w:t>20 h : cours 6 h, lab 5 h 30, projet 3 h 30, reverse engineering 3 h, rédaction 1 h, revue 1 h</w:t>
             </w:r>
           </w:p>
         </w:tc>
         <w:tc>
           <w:tcPr>
-            <w:tcW w:type="dxa" w:w="3288"/>
+            <w:tcW w:type="dxa" w:w="3685"/>
           </w:tcPr>
           <w:p>
             <w:pPr>
@@ -957,7 +957,7 @@
               <w:rPr>
                 <w:sz w:val="16"/>
               </w:rPr>
-              <w:t>Cours 3 h, lab 3 h, projet 1 h 30, reverse engineering 1 h, revue 1 h</w:t>
+              <w:t>19 h : cours 6 h 30, lab 5 h, projet 4 h 30, reverse engineering 2 h, revue 1 h</w:t>
             </w:r>
           </w:p>
         </w:tc>
@@ -968,7 +968,7 @@
         </w:trPr>
         <w:tc>
           <w:tcPr>
-            <w:tcW w:type="dxa" w:w="2381"/>
+            <w:tcW w:type="dxa" w:w="2041"/>
           </w:tcPr>
           <w:p>
             <w:pPr>
@@ -986,7 +986,7 @@
         </w:tc>
         <w:tc>
           <w:tcPr>
-            <w:tcW w:type="dxa" w:w="3969"/>
+            <w:tcW w:type="dxa" w:w="3912"/>
           </w:tcPr>
           <w:p>
             <w:pPr>
@@ -997,13 +997,13 @@
               <w:rPr>
                 <w:sz w:val="16"/>
               </w:rPr>
-              <w:t>CRTL 4 h, lab 5 h, projet 3 h, reverse engineering 1 h, rédaction et candidatures 1 h 30, revue 30 min</w:t>
+              <w:t>20 h : CRTL 6 h, lab 5 h 30, projet 4 h, reverse engineering 1 h 30, candidatures 2 h 30, revue 30 min</w:t>
             </w:r>
           </w:p>
         </w:tc>
         <w:tc>
           <w:tcPr>
-            <w:tcW w:type="dxa" w:w="3288"/>
+            <w:tcW w:type="dxa" w:w="3685"/>
           </w:tcPr>
           <w:p>
             <w:pPr>
@@ -1014,7 +1014,7 @@
               <w:rPr>
                 <w:sz w:val="16"/>
               </w:rPr>
-              <w:t>CRTL 3 h, lab 3 h, projet 2 h, candidatures 1 h, revue 30 min</w:t>
+              <w:t>19 h : CRTL 6 h 30, lab 5 h, projet 4 h, reverse engineering 1 h 30, candidatures 1 h 30, revue 30 min</w:t>
             </w:r>
           </w:p>
         </w:tc>
@@ -1031,7 +1031,7 @@
           <w:i/>
           <w:sz w:val="19"/>
         </w:rPr>
-        <w:t>Si l'école dépasse 1 h par semaine en moyenne, c'est le lab qui cède en premier, jamais le projet logiciel.</w:t>
+        <w:t>Pendant la préparation de la BSCP, le lab s'arrête trois semaines avant l'examen et ses heures vont à la BSCP. Si le projet de l'école ou les cours dépassent ce qui est prévu, c'est le lab qui cède en premier, jamais le projet logiciel.</w:t>
       </w:r>
     </w:p>
     <w:p>
@@ -1047,7 +1047,7 @@
         <w:rPr>
           <w:i w:val="0"/>
         </w:rPr>
-        <w:t>Base de calcul (avis) : 5 h de lab par semaine en entreprise et 3 h à l'école, soit 18 à 20 h par mois. Un lab à la fois. Rapports de lab toujours privés (règle HackTheBox).</w:t>
+        <w:t>Base de calcul (avis) : 5 à 7 h de lab par semaine selon la phase, soit 22 à 28 h par mois, environ 260 h d'ici le 8 octobre 2027. Un lab à la fois. Rapports de lab toujours privés (règle HackTheBox).</w:t>
       </w:r>
     </w:p>
     <w:tbl>
@@ -1412,7 +1412,7 @@
               <w:rPr>
                 <w:sz w:val="16"/>
               </w:rPr>
-              <w:t>55 à 65 (plafond 60)</w:t>
+              <w:t>80 à 100 (plafond 90)</w:t>
             </w:r>
           </w:p>
         </w:tc>
@@ -1429,7 +1429,7 @@
               <w:rPr>
                 <w:sz w:val="16"/>
               </w:rPr>
-              <w:t>Utilisateurs simulés confirmés ; accès initial et opération en réseau. Version plafonnée (durée complète : 80 à 100 h).</w:t>
+              <w:t>Utilisateurs simulés confirmés ; accès initial et opération en réseau. Presque complet (durée complète : 80 à 100 h).</w:t>
             </w:r>
           </w:p>
         </w:tc>
@@ -1486,7 +1486,7 @@
               <w:rPr>
                 <w:sz w:val="16"/>
               </w:rPr>
-              <w:t>60 à 70 (plafond 65)</w:t>
+              <w:t>70 à 100 (plafond 90)</w:t>
             </w:r>
           </w:p>
         </w:tc>
@@ -1900,7 +1900,7 @@
               <w:rPr>
                 <w:sz w:val="16"/>
               </w:rPr>
-              <w:t>2 h 30 jusqu'à mi-déc. 2026, pause, puis 4 h dès mi-févr. 2027</w:t>
+              <w:t>7 à 8 h jusqu'à mi-déc. 2026 (plateforme de C), pause, puis 5 à 6 h dès mi-févr. 2027 (fin du C, Sektor7, projet)</w:t>
             </w:r>
           </w:p>
         </w:tc>
@@ -1917,7 +1917,7 @@
               <w:rPr>
                 <w:sz w:val="16"/>
               </w:rPr>
-              <w:t>Modules 1 à 12 terminés avant fin juin 2027. Deux projets publics non offensifs ou orientés détection, avec tests, documentation et historique lisible.</w:t>
+              <w:t>Modules 1 à 12 terminés avant fin mars 2027. Deux projets publics non offensifs ou orientés détection, avec tests, documentation et historique lisible.</w:t>
             </w:r>
           </w:p>
         </w:tc>
@@ -1974,7 +1974,7 @@
               <w:rPr>
                 <w:sz w:val="16"/>
               </w:rPr>
-              <w:t>2 h de juil. 2027 à janv. 2028, puis 1 h</w:t>
+              <w:t>2 à 3 h de juil. 2027 à janv. 2028, puis 1 h 30</w:t>
             </w:r>
           </w:p>
         </w:tc>
@@ -2156,7 +2156,7 @@
           <w:i w:val="0"/>
           <w:sz w:val="19"/>
         </w:rPr>
-        <w:t>Rythme du C (avis, 25 à 40 min par exercice) : les modules 1 à 12 de la plateforme représentent 141 exercices, soit 59 à 94 h. Vise environ 6 exercices par semaine jusqu'à mi-décembre (modules 1 à 6), puis environ 10 par semaine dès mi-février. Tu termines alors entre mi-avril et fin juin 2027. Sektor7 démarre après le module 11 (mémoire dynamique), le premier projet C de juin à août 2027. Les modules 13 à 24 (algorithmique) sont un fond : commence par « Tri et recherche », « Structures de données » et « Algorithmique de la cybersécurité ». Note tes exercices réussis chaque dimanche.</w:t>
+        <w:t>Rythme du C (avis, 25 à 40 min par exercice) : les modules 1 à 12 de la plateforme représentent 141 exercices, soit 59 à 94 h. Avec 7 à 8 h de C par semaine jusqu'à mi-décembre, tu en réussis entre 105 et 141 avant la pause ; le reste se termine dès mi-février, au plus tard fin mars 2027. Sektor7 démarre dès que les modules 1 à 12 sont terminés (mars à mai 2027), le premier projet C suit (avril à juin). Les modules 13 à 24 (algorithmique) sont un fond : commence par « Tri et recherche », « Structures de données » et « Algorithmique de la cybersécurité ». Note tes exercices réussis chaque dimanche.</w:t>
       </w:r>
     </w:p>
     <w:p>
@@ -2398,7 +2398,7 @@
               <w:rPr>
                 <w:sz w:val="16"/>
               </w:rPr>
-              <w:t>CRTO, avec le C en parallèle (Sektor7 dès le module 11 terminé ; lab CRTO à accès à vie, confirmé par toi).</w:t>
+              <w:t>CRTO, avec le C puis Sektor7 en parallèle (lab CRTO à accès à vie, confirmé par toi).</w:t>
             </w:r>
           </w:p>
         </w:tc>
@@ -2472,7 +2472,7 @@
               <w:rPr>
                 <w:sz w:val="16"/>
               </w:rPr>
-              <w:t>Publier uniquement après accord écrit de l'employeur ; sinon rapports privés partagés en entretien. Orienter un éventuel projet de M2 vers le Red Team.</w:t>
+              <w:t>Publier uniquement après accord écrit de l'employeur ; sinon rapports privés partagés en entretien. Orienter un éventuel projet de M2 vers le Red Team. Critère C (fin mars 2027) : modules 1 à 12 du C terminés ; sinon Maldev Academy et EDR Internals sont reportés et le CRTL est privilégié.</w:t>
             </w:r>
           </w:p>
         </w:tc>
@@ -2546,7 +2546,7 @@
               <w:rPr>
                 <w:sz w:val="16"/>
               </w:rPr>
-              <w:t>CRTL. CETP seulement si nettement plus demandé dans 30 offres ciblées ou si un budget se libère. Critère C : modules 1 à 12 terminés fin juin 2027 ; sinon Maldev Academy et EDR Internals sont reportés et le CRTL est privilégié.</w:t>
+              <w:t>CRTL. CETP seulement si nettement plus demandé dans 30 offres ciblées ou si un budget se libère.</w:t>
             </w:r>
           </w:p>
         </w:tc>
@@ -2992,7 +2992,7 @@
               <w:rPr>
                 <w:sz w:val="16"/>
               </w:rPr>
-              <w:t>Supprimer le lab en premier (passer aux Mini Pro Labs), garder le cours et le projet. Ne jamais sacrifier le dimanche libre ni les deux semaines de congés d'été.</w:t>
+              <w:t>Supprimer d'abord le samedi (retour à 15 h par semaine, 3 h chaque soir), puis le lab (passer aux Mini Pro Labs) ; garder le cours et le projet. Ne jamais sacrifier le dimanche libre ni les deux semaines de congés d'été.</w:t>
             </w:r>
           </w:p>
         </w:tc>
@@ -3789,7 +3789,7 @@
           <w:color w:val="555555"/>
           <w:sz w:val="18"/>
         </w:rPr>
-        <w:t>Informations que tu m'as données le 14 octobre 2026 et que je n'ai pas pu vérifier : abonnement HackTheBox actif jusqu'au 8 octobre 2027 avec accès aux Pro Labs et Mini Pro Labs ; lab CRTO inclus dans ton achat, avec un accès à vie ; labs Push et Sidecar disponibles ; cours EDR édité par Maldev Academy ; contrat d'apprentissage de deux ans au ministère sans activité offensive ; pas de mémoire ni de soutenance en M2 ; fin du travail à 16 h 30, retour vers 17 h 15, travail possible jusque vers 21 h. Contrôle des sources : annexe B.</w:t>
+        <w:t>Informations que tu m'as données le 14 octobre 2026 et que je n'ai pas pu vérifier : abonnement HackTheBox actif jusqu'au 8 octobre 2027 avec accès aux Pro Labs et Mini Pro Labs ; lab CRTO inclus dans ton achat, avec un accès à vie ; labs Push et Sidecar disponibles ; cours EDR édité par Maldev Academy ; contrat d'apprentissage de deux ans au ministère sans activité offensive ; pas de mémoire ni de soutenance en M2 ; fin du travail à 16 h 30, retour vers 17 h 15, au moins 3 h de travail chaque soir en semaine. Contrôle des sources : annexe B.</w:t>
       </w:r>
     </w:p>
     <w:p>
@@ -3819,7 +3819,7 @@
           <w:i w:val="0"/>
           <w:sz w:val="19"/>
         </w:rPr>
-        <w:t>Pour chaque phase, deux emplois du temps : la semaine d'entreprise (15 h) à gauche, la semaine d'école (9 h 30) à droite. Chaque case indique l'activité du jour et sa durée, dans l'ordre de la journée, de haut en bas ; le dimanche reste libre. Répartition proposée (avis) : tu peux déplacer une séance d'un jour à l'autre sans changer les totaux.</w:t>
+        <w:t>Pour chaque phase, deux emplois du temps : la semaine d'entreprise à gauche, la semaine d'école à droite, avec le total d'heures dans chaque titre. Chaque case indique l'activité du jour et sa durée, dans l'ordre de la journée, de haut en bas ; 3 h chaque soir du lundi au vendredi, le samedi plus léger, le dimanche libre. Les temps d'école sont remplacés par l'activité réellement prévue. Répartition proposée (avis) : tu peux déplacer une séance d'un jour à l'autre sans changer les totaux.</w:t>
       </w:r>
     </w:p>
     <w:p>

</xml_diff>